<commit_message>
Hope lab 3 done
</commit_message>
<xml_diff>
--- a/network/lab-3/ПРИ123-ИС-#03-Нямаа.docx
+++ b/network/lab-3/ПРИ123-ИС-#03-Нямаа.docx
@@ -672,14 +672,7 @@
           <w:sz w:val="44"/>
           <w:szCs w:val="44"/>
         </w:rPr>
-        <w:t>Лабораторная работа №</w:t>
-      </w:r>
-      <w:r>
-        <w:rPr>
-          <w:sz w:val="44"/>
-          <w:szCs w:val="44"/>
-        </w:rPr>
-        <w:t>3</w:t>
+        <w:t>Лабораторная работа №3</w:t>
       </w:r>
     </w:p>
     <w:p>
@@ -1157,7 +1150,7 @@
         <w:rPr>
           <w:sz w:val="28"/>
         </w:rPr>
-        <w:t xml:space="preserve">Данная лабораторная работы </w:t>
+        <w:t>Для выполнения данной лабораторной работы использовался язык программирования Python и фреймворк FastApi для реализации RestfulApi взаимодействия клиента и сервера.</w:t>
       </w:r>
     </w:p>
     <w:p>
@@ -1171,7 +1164,2429 @@
         </w:rPr>
       </w:pPr>
       <w:r>
+        <w:rPr>
+          <w:sz w:val="28"/>
+        </w:rPr>
+        <w:t>Листинг сервера 1:</w:t>
+      </w:r>
+    </w:p>
+    <w:p>
+      <w:pPr>
+        <w:pStyle w:val="Normal"/>
+        <w:spacing w:lineRule="atLeast" w:line="285"/>
+        <w:ind w:hanging="0" w:left="0" w:right="0"/>
+        <w:rPr>
+          <w:rFonts w:ascii="Courier new" w:hAnsi="Courier new"/>
+          <w:b w:val="false"/>
+          <w:color w:val="000000"/>
+          <w:sz w:val="20"/>
+          <w:szCs w:val="20"/>
+          <w:highlight w:val="none"/>
+          <w:shd w:fill="FFFFFF" w:val="clear"/>
+        </w:rPr>
+      </w:pPr>
+      <w:r>
+        <w:rPr>
+          <w:rFonts w:ascii="Courier new" w:hAnsi="Courier new"/>
+          <w:b w:val="false"/>
+          <w:color w:val="000000"/>
+          <w:sz w:val="20"/>
+          <w:szCs w:val="20"/>
+          <w:shd w:fill="FFFFFF" w:val="clear"/>
+        </w:rPr>
+        <w:t>from fastapi import FastAPI, HTTPException</w:t>
+      </w:r>
+    </w:p>
+    <w:p>
+      <w:pPr>
+        <w:pStyle w:val="Normal"/>
+        <w:spacing w:lineRule="atLeast" w:line="285"/>
+        <w:ind w:hanging="0" w:left="0" w:right="0"/>
+        <w:rPr>
+          <w:rFonts w:ascii="Courier new" w:hAnsi="Courier new"/>
+          <w:b w:val="false"/>
+          <w:color w:val="000000"/>
+          <w:sz w:val="20"/>
+          <w:szCs w:val="20"/>
+          <w:highlight w:val="none"/>
+          <w:shd w:fill="FFFFFF" w:val="clear"/>
+        </w:rPr>
+      </w:pPr>
+      <w:r>
+        <w:rPr>
+          <w:rFonts w:ascii="Courier new" w:hAnsi="Courier new"/>
+          <w:b w:val="false"/>
+          <w:color w:val="000000"/>
+          <w:sz w:val="20"/>
+          <w:szCs w:val="20"/>
+          <w:shd w:fill="FFFFFF" w:val="clear"/>
+        </w:rPr>
+        <w:t>from fastapi.responses import FileResponse, StreamingResponse</w:t>
+      </w:r>
+    </w:p>
+    <w:p>
+      <w:pPr>
+        <w:pStyle w:val="Normal"/>
+        <w:spacing w:lineRule="atLeast" w:line="285"/>
+        <w:ind w:hanging="0" w:left="0" w:right="0"/>
+        <w:rPr>
+          <w:rFonts w:ascii="Courier new" w:hAnsi="Courier new"/>
+          <w:b w:val="false"/>
+          <w:color w:val="000000"/>
+          <w:sz w:val="20"/>
+          <w:szCs w:val="20"/>
+          <w:highlight w:val="none"/>
+          <w:shd w:fill="FFFFFF" w:val="clear"/>
+        </w:rPr>
+      </w:pPr>
+      <w:r>
+        <w:rPr>
+          <w:rFonts w:ascii="Courier new" w:hAnsi="Courier new"/>
+          <w:b w:val="false"/>
+          <w:color w:val="000000"/>
+          <w:sz w:val="20"/>
+          <w:szCs w:val="20"/>
+          <w:shd w:fill="FFFFFF" w:val="clear"/>
+        </w:rPr>
+        <w:t>import os</w:t>
+      </w:r>
+    </w:p>
+    <w:p>
+      <w:pPr>
+        <w:pStyle w:val="Normal"/>
+        <w:spacing w:lineRule="atLeast" w:line="285"/>
+        <w:ind w:hanging="0" w:left="0" w:right="0"/>
+        <w:rPr>
+          <w:rFonts w:ascii="Courier new" w:hAnsi="Courier new"/>
+          <w:b w:val="false"/>
+          <w:color w:val="000000"/>
+          <w:sz w:val="20"/>
+          <w:szCs w:val="20"/>
+          <w:highlight w:val="none"/>
+          <w:shd w:fill="FFFFFF" w:val="clear"/>
+        </w:rPr>
+      </w:pPr>
+      <w:r>
+        <w:rPr>
+          <w:rFonts w:ascii="Courier new" w:hAnsi="Courier new"/>
+          <w:b w:val="false"/>
+          <w:color w:val="000000"/>
+          <w:sz w:val="20"/>
+          <w:szCs w:val="20"/>
+          <w:shd w:fill="FFFFFF" w:val="clear"/>
+        </w:rPr>
+        <w:t>import requests</w:t>
+      </w:r>
+    </w:p>
+    <w:p>
+      <w:pPr>
+        <w:pStyle w:val="Normal"/>
+        <w:spacing w:lineRule="atLeast" w:line="285"/>
+        <w:ind w:hanging="0" w:left="0" w:right="0"/>
+        <w:rPr>
+          <w:rFonts w:ascii="Courier new" w:hAnsi="Courier new"/>
+          <w:b w:val="false"/>
+          <w:color w:val="000000"/>
+          <w:sz w:val="20"/>
+          <w:szCs w:val="20"/>
+          <w:highlight w:val="none"/>
+          <w:shd w:fill="FFFFFF" w:val="clear"/>
+        </w:rPr>
+      </w:pPr>
+      <w:r>
+        <w:rPr>
+          <w:rFonts w:ascii="Courier new" w:hAnsi="Courier new"/>
+          <w:b w:val="false"/>
+          <w:color w:val="000000"/>
+          <w:sz w:val="20"/>
+          <w:szCs w:val="20"/>
+          <w:shd w:fill="FFFFFF" w:val="clear"/>
+        </w:rPr>
+      </w:r>
+    </w:p>
+    <w:p>
+      <w:pPr>
+        <w:pStyle w:val="Normal"/>
+        <w:spacing w:lineRule="atLeast" w:line="285"/>
+        <w:ind w:hanging="0" w:left="0" w:right="0"/>
+        <w:rPr>
+          <w:rFonts w:ascii="Courier new" w:hAnsi="Courier new"/>
+          <w:b w:val="false"/>
+          <w:color w:val="000000"/>
+          <w:sz w:val="20"/>
+          <w:szCs w:val="20"/>
+          <w:highlight w:val="none"/>
+          <w:shd w:fill="FFFFFF" w:val="clear"/>
+        </w:rPr>
+      </w:pPr>
+      <w:r>
+        <w:rPr>
+          <w:rFonts w:ascii="Courier new" w:hAnsi="Courier new"/>
+          <w:b w:val="false"/>
+          <w:color w:val="000000"/>
+          <w:sz w:val="20"/>
+          <w:szCs w:val="20"/>
+          <w:shd w:fill="FFFFFF" w:val="clear"/>
+        </w:rPr>
+        <w:t>application = FastAPI()</w:t>
+      </w:r>
+    </w:p>
+    <w:p>
+      <w:pPr>
+        <w:pStyle w:val="Normal"/>
+        <w:spacing w:lineRule="atLeast" w:line="285"/>
+        <w:ind w:hanging="0" w:left="0" w:right="0"/>
+        <w:rPr>
+          <w:rFonts w:ascii="Courier new" w:hAnsi="Courier new"/>
+          <w:b w:val="false"/>
+          <w:color w:val="000000"/>
+          <w:sz w:val="20"/>
+          <w:szCs w:val="20"/>
+          <w:highlight w:val="none"/>
+          <w:shd w:fill="FFFFFF" w:val="clear"/>
+        </w:rPr>
+      </w:pPr>
+      <w:r>
+        <w:rPr>
+          <w:rFonts w:ascii="Courier new" w:hAnsi="Courier new"/>
+          <w:b w:val="false"/>
+          <w:color w:val="000000"/>
+          <w:sz w:val="20"/>
+          <w:szCs w:val="20"/>
+          <w:shd w:fill="FFFFFF" w:val="clear"/>
+        </w:rPr>
+      </w:r>
+    </w:p>
+    <w:p>
+      <w:pPr>
+        <w:pStyle w:val="Normal"/>
+        <w:spacing w:lineRule="atLeast" w:line="285"/>
+        <w:ind w:hanging="0" w:left="0" w:right="0"/>
+        <w:rPr>
+          <w:rFonts w:ascii="Courier new" w:hAnsi="Courier new"/>
+          <w:b w:val="false"/>
+          <w:color w:val="000000"/>
+          <w:sz w:val="20"/>
+          <w:szCs w:val="20"/>
+          <w:highlight w:val="none"/>
+          <w:shd w:fill="FFFFFF" w:val="clear"/>
+        </w:rPr>
+      </w:pPr>
+      <w:r>
+        <w:rPr>
+          <w:rFonts w:ascii="Courier new" w:hAnsi="Courier new"/>
+          <w:b w:val="false"/>
+          <w:color w:val="000000"/>
+          <w:sz w:val="20"/>
+          <w:szCs w:val="20"/>
+          <w:shd w:fill="FFFFFF" w:val="clear"/>
+        </w:rPr>
+        <w:t>additional_servers = [</w:t>
+      </w:r>
+    </w:p>
+    <w:p>
+      <w:pPr>
+        <w:pStyle w:val="Normal"/>
+        <w:spacing w:lineRule="atLeast" w:line="285"/>
+        <w:ind w:hanging="0" w:left="0" w:right="0"/>
+        <w:rPr>
+          <w:rFonts w:ascii="Courier new" w:hAnsi="Courier new"/>
+          <w:b w:val="false"/>
+          <w:color w:val="000000"/>
+          <w:sz w:val="20"/>
+          <w:szCs w:val="20"/>
+          <w:highlight w:val="none"/>
+          <w:shd w:fill="FFFFFF" w:val="clear"/>
+        </w:rPr>
+      </w:pPr>
+      <w:r>
+        <w:rPr>
+          <w:rFonts w:ascii="Courier new" w:hAnsi="Courier new"/>
+          <w:b w:val="false"/>
+          <w:color w:val="000000"/>
+          <w:sz w:val="20"/>
+          <w:szCs w:val="20"/>
+          <w:shd w:fill="FFFFFF" w:val="clear"/>
+        </w:rPr>
+        <w:t>{"protocol": "http", "host": "localhost", "port": 8111}</w:t>
+      </w:r>
+    </w:p>
+    <w:p>
+      <w:pPr>
+        <w:pStyle w:val="Normal"/>
+        <w:spacing w:lineRule="atLeast" w:line="285"/>
+        <w:ind w:hanging="0" w:left="0" w:right="0"/>
+        <w:rPr>
+          <w:rFonts w:ascii="Courier new" w:hAnsi="Courier new"/>
+          <w:b w:val="false"/>
+          <w:color w:val="000000"/>
+          <w:sz w:val="20"/>
+          <w:szCs w:val="20"/>
+          <w:highlight w:val="none"/>
+          <w:shd w:fill="FFFFFF" w:val="clear"/>
+        </w:rPr>
+      </w:pPr>
+      <w:r>
+        <w:rPr>
+          <w:rFonts w:ascii="Courier new" w:hAnsi="Courier new"/>
+          <w:b w:val="false"/>
+          <w:color w:val="000000"/>
+          <w:sz w:val="20"/>
+          <w:szCs w:val="20"/>
+          <w:shd w:fill="FFFFFF" w:val="clear"/>
+        </w:rPr>
+        <w:t>]</w:t>
+      </w:r>
+    </w:p>
+    <w:p>
+      <w:pPr>
+        <w:pStyle w:val="Normal"/>
+        <w:spacing w:lineRule="atLeast" w:line="285"/>
+        <w:ind w:hanging="0" w:left="0" w:right="0"/>
+        <w:rPr>
+          <w:rFonts w:ascii="Courier new" w:hAnsi="Courier new"/>
+          <w:b w:val="false"/>
+          <w:color w:val="000000"/>
+          <w:sz w:val="20"/>
+          <w:szCs w:val="20"/>
+          <w:highlight w:val="none"/>
+          <w:shd w:fill="FFFFFF" w:val="clear"/>
+        </w:rPr>
+      </w:pPr>
+      <w:r>
+        <w:rPr>
+          <w:rFonts w:ascii="Courier new" w:hAnsi="Courier new"/>
+          <w:b w:val="false"/>
+          <w:color w:val="000000"/>
+          <w:sz w:val="20"/>
+          <w:szCs w:val="20"/>
+          <w:shd w:fill="FFFFFF" w:val="clear"/>
+        </w:rPr>
+      </w:r>
+    </w:p>
+    <w:p>
+      <w:pPr>
+        <w:pStyle w:val="Normal"/>
+        <w:spacing w:lineRule="atLeast" w:line="285"/>
+        <w:ind w:hanging="0" w:left="0" w:right="0"/>
+        <w:rPr>
+          <w:rFonts w:ascii="Courier new" w:hAnsi="Courier new"/>
+          <w:b w:val="false"/>
+          <w:color w:val="000000"/>
+          <w:sz w:val="20"/>
+          <w:szCs w:val="20"/>
+          <w:highlight w:val="none"/>
+          <w:shd w:fill="FFFFFF" w:val="clear"/>
+        </w:rPr>
+      </w:pPr>
+      <w:r>
+        <w:rPr>
+          <w:rFonts w:ascii="Courier new" w:hAnsi="Courier new"/>
+          <w:b w:val="false"/>
+          <w:color w:val="000000"/>
+          <w:sz w:val="20"/>
+          <w:szCs w:val="20"/>
+          <w:shd w:fill="FFFFFF" w:val="clear"/>
+        </w:rPr>
+        <w:t>files_dir = f"{os.getcwd()}/firstServer/files/"</w:t>
+      </w:r>
+    </w:p>
+    <w:p>
+      <w:pPr>
+        <w:pStyle w:val="Normal"/>
+        <w:spacing w:lineRule="atLeast" w:line="285"/>
+        <w:ind w:hanging="0" w:left="0" w:right="0"/>
+        <w:rPr>
+          <w:rFonts w:ascii="Courier new" w:hAnsi="Courier new"/>
+          <w:b w:val="false"/>
+          <w:color w:val="000000"/>
+          <w:sz w:val="20"/>
+          <w:szCs w:val="20"/>
+          <w:highlight w:val="none"/>
+          <w:shd w:fill="FFFFFF" w:val="clear"/>
+        </w:rPr>
+      </w:pPr>
+      <w:r>
+        <w:rPr>
+          <w:rFonts w:ascii="Courier new" w:hAnsi="Courier new"/>
+          <w:b w:val="false"/>
+          <w:color w:val="000000"/>
+          <w:sz w:val="20"/>
+          <w:szCs w:val="20"/>
+          <w:shd w:fill="FFFFFF" w:val="clear"/>
+        </w:rPr>
+        <w:t>server_count = "first"</w:t>
+      </w:r>
+    </w:p>
+    <w:p>
+      <w:pPr>
+        <w:pStyle w:val="Normal"/>
+        <w:spacing w:lineRule="atLeast" w:line="285"/>
+        <w:ind w:hanging="0" w:left="0" w:right="0"/>
+        <w:rPr>
+          <w:rFonts w:ascii="Courier new" w:hAnsi="Courier new"/>
+          <w:b w:val="false"/>
+          <w:color w:val="000000"/>
+          <w:sz w:val="20"/>
+          <w:szCs w:val="20"/>
+          <w:highlight w:val="none"/>
+          <w:shd w:fill="FFFFFF" w:val="clear"/>
+        </w:rPr>
+      </w:pPr>
+      <w:r>
+        <w:rPr>
+          <w:rFonts w:ascii="Courier new" w:hAnsi="Courier new"/>
+          <w:b w:val="false"/>
+          <w:color w:val="000000"/>
+          <w:sz w:val="20"/>
+          <w:szCs w:val="20"/>
+          <w:shd w:fill="FFFFFF" w:val="clear"/>
+        </w:rPr>
+      </w:r>
+    </w:p>
+    <w:p>
+      <w:pPr>
+        <w:pStyle w:val="Normal"/>
+        <w:spacing w:lineRule="atLeast" w:line="285"/>
+        <w:ind w:hanging="0" w:left="0" w:right="0"/>
+        <w:rPr>
+          <w:rFonts w:ascii="Courier new" w:hAnsi="Courier new"/>
+          <w:b w:val="false"/>
+          <w:color w:val="000000"/>
+          <w:sz w:val="20"/>
+          <w:szCs w:val="20"/>
+          <w:highlight w:val="none"/>
+          <w:shd w:fill="FFFFFF" w:val="clear"/>
+        </w:rPr>
+      </w:pPr>
+      <w:r>
+        <w:rPr>
+          <w:rFonts w:ascii="Courier new" w:hAnsi="Courier new"/>
+          <w:b w:val="false"/>
+          <w:color w:val="000000"/>
+          <w:sz w:val="20"/>
+          <w:szCs w:val="20"/>
+          <w:shd w:fill="FFFFFF" w:val="clear"/>
+        </w:rPr>
+        <w:t>@application.get("/api/files")</w:t>
+      </w:r>
+    </w:p>
+    <w:p>
+      <w:pPr>
+        <w:pStyle w:val="Normal"/>
+        <w:spacing w:lineRule="atLeast" w:line="285"/>
+        <w:ind w:hanging="0" w:left="0" w:right="0"/>
+        <w:rPr>
+          <w:rFonts w:ascii="Courier new" w:hAnsi="Courier new"/>
+          <w:b w:val="false"/>
+          <w:color w:val="000000"/>
+          <w:sz w:val="20"/>
+          <w:szCs w:val="20"/>
+          <w:highlight w:val="none"/>
+          <w:shd w:fill="FFFFFF" w:val="clear"/>
+        </w:rPr>
+      </w:pPr>
+      <w:r>
+        <w:rPr>
+          <w:rFonts w:ascii="Courier new" w:hAnsi="Courier new"/>
+          <w:b w:val="false"/>
+          <w:color w:val="000000"/>
+          <w:sz w:val="20"/>
+          <w:szCs w:val="20"/>
+          <w:shd w:fill="FFFFFF" w:val="clear"/>
+        </w:rPr>
+        <w:t>def getAllFiles():</w:t>
+      </w:r>
+    </w:p>
+    <w:p>
+      <w:pPr>
+        <w:pStyle w:val="Normal"/>
+        <w:spacing w:lineRule="atLeast" w:line="285"/>
+        <w:ind w:hanging="0" w:left="0" w:right="0"/>
+        <w:rPr>
+          <w:rFonts w:ascii="Courier new" w:hAnsi="Courier new"/>
+          <w:b w:val="false"/>
+          <w:color w:val="000000"/>
+          <w:sz w:val="20"/>
+          <w:szCs w:val="20"/>
+          <w:highlight w:val="none"/>
+          <w:shd w:fill="FFFFFF" w:val="clear"/>
+        </w:rPr>
+      </w:pPr>
+      <w:r>
+        <w:rPr>
+          <w:rFonts w:ascii="Courier new" w:hAnsi="Courier new"/>
+          <w:b w:val="false"/>
+          <w:color w:val="000000"/>
+          <w:sz w:val="20"/>
+          <w:szCs w:val="20"/>
+          <w:shd w:fill="FFFFFF" w:val="clear"/>
+        </w:rPr>
+        <w:t>files = []</w:t>
+      </w:r>
+    </w:p>
+    <w:p>
+      <w:pPr>
+        <w:pStyle w:val="Normal"/>
+        <w:spacing w:lineRule="atLeast" w:line="285"/>
+        <w:ind w:hanging="0" w:left="0" w:right="0"/>
+        <w:rPr>
+          <w:rFonts w:ascii="Courier new" w:hAnsi="Courier new"/>
+          <w:b w:val="false"/>
+          <w:color w:val="000000"/>
+          <w:sz w:val="20"/>
+          <w:szCs w:val="20"/>
+          <w:highlight w:val="none"/>
+          <w:shd w:fill="FFFFFF" w:val="clear"/>
+        </w:rPr>
+      </w:pPr>
+      <w:r>
+        <w:rPr>
+          <w:rFonts w:ascii="Courier new" w:hAnsi="Courier new"/>
+          <w:b w:val="false"/>
+          <w:color w:val="000000"/>
+          <w:sz w:val="20"/>
+          <w:szCs w:val="20"/>
+          <w:shd w:fill="FFFFFF" w:val="clear"/>
+        </w:rPr>
+        <w:t>for filename in os.listdir(files_dir):</w:t>
+      </w:r>
+    </w:p>
+    <w:p>
+      <w:pPr>
+        <w:pStyle w:val="Normal"/>
+        <w:spacing w:lineRule="atLeast" w:line="285"/>
+        <w:ind w:hanging="0" w:left="0" w:right="0"/>
+        <w:rPr>
+          <w:rFonts w:ascii="Courier new" w:hAnsi="Courier new"/>
+          <w:b w:val="false"/>
+          <w:color w:val="000000"/>
+          <w:sz w:val="20"/>
+          <w:szCs w:val="20"/>
+          <w:highlight w:val="none"/>
+          <w:shd w:fill="FFFFFF" w:val="clear"/>
+        </w:rPr>
+      </w:pPr>
+      <w:r>
+        <w:rPr>
+          <w:rFonts w:ascii="Courier new" w:hAnsi="Courier new"/>
+          <w:b w:val="false"/>
+          <w:color w:val="000000"/>
+          <w:sz w:val="20"/>
+          <w:szCs w:val="20"/>
+          <w:shd w:fill="FFFFFF" w:val="clear"/>
+        </w:rPr>
+        <w:t>filepath = f"{files_dir}/{filename}"</w:t>
+      </w:r>
+    </w:p>
+    <w:p>
+      <w:pPr>
+        <w:pStyle w:val="Normal"/>
+        <w:spacing w:lineRule="atLeast" w:line="285"/>
+        <w:ind w:hanging="0" w:left="0" w:right="0"/>
+        <w:rPr>
+          <w:rFonts w:ascii="Courier new" w:hAnsi="Courier new"/>
+          <w:b w:val="false"/>
+          <w:color w:val="000000"/>
+          <w:sz w:val="20"/>
+          <w:szCs w:val="20"/>
+          <w:highlight w:val="none"/>
+          <w:shd w:fill="FFFFFF" w:val="clear"/>
+        </w:rPr>
+      </w:pPr>
+      <w:r>
+        <w:rPr>
+          <w:rFonts w:ascii="Courier new" w:hAnsi="Courier new"/>
+          <w:b w:val="false"/>
+          <w:color w:val="000000"/>
+          <w:sz w:val="20"/>
+          <w:szCs w:val="20"/>
+          <w:shd w:fill="FFFFFF" w:val="clear"/>
+        </w:rPr>
+        <w:t>files.append({</w:t>
+      </w:r>
+    </w:p>
+    <w:p>
+      <w:pPr>
+        <w:pStyle w:val="Normal"/>
+        <w:spacing w:lineRule="atLeast" w:line="285"/>
+        <w:ind w:hanging="0" w:left="0" w:right="0"/>
+        <w:rPr>
+          <w:rFonts w:ascii="Courier new" w:hAnsi="Courier new"/>
+          <w:b w:val="false"/>
+          <w:color w:val="000000"/>
+          <w:sz w:val="20"/>
+          <w:szCs w:val="20"/>
+          <w:highlight w:val="none"/>
+          <w:shd w:fill="FFFFFF" w:val="clear"/>
+        </w:rPr>
+      </w:pPr>
+      <w:r>
+        <w:rPr>
+          <w:rFonts w:ascii="Courier new" w:hAnsi="Courier new"/>
+          <w:b w:val="false"/>
+          <w:color w:val="000000"/>
+          <w:sz w:val="20"/>
+          <w:szCs w:val="20"/>
+          <w:shd w:fill="FFFFFF" w:val="clear"/>
+        </w:rPr>
+        <w:t>"name": filename,</w:t>
+      </w:r>
+    </w:p>
+    <w:p>
+      <w:pPr>
+        <w:pStyle w:val="Normal"/>
+        <w:spacing w:lineRule="atLeast" w:line="285"/>
+        <w:ind w:hanging="0" w:left="0" w:right="0"/>
+        <w:rPr>
+          <w:rFonts w:ascii="Courier new" w:hAnsi="Courier new"/>
+          <w:b w:val="false"/>
+          <w:color w:val="000000"/>
+          <w:sz w:val="20"/>
+          <w:szCs w:val="20"/>
+          <w:highlight w:val="none"/>
+          <w:shd w:fill="FFFFFF" w:val="clear"/>
+        </w:rPr>
+      </w:pPr>
+      <w:r>
+        <w:rPr>
+          <w:rFonts w:ascii="Courier new" w:hAnsi="Courier new"/>
+          <w:b w:val="false"/>
+          <w:color w:val="000000"/>
+          <w:sz w:val="20"/>
+          <w:szCs w:val="20"/>
+          <w:shd w:fill="FFFFFF" w:val="clear"/>
+        </w:rPr>
+        <w:t>"path": filepath,</w:t>
+      </w:r>
+    </w:p>
+    <w:p>
+      <w:pPr>
+        <w:pStyle w:val="Normal"/>
+        <w:spacing w:lineRule="atLeast" w:line="285"/>
+        <w:ind w:hanging="0" w:left="0" w:right="0"/>
+        <w:rPr>
+          <w:rFonts w:ascii="Courier new" w:hAnsi="Courier new"/>
+          <w:b w:val="false"/>
+          <w:color w:val="000000"/>
+          <w:sz w:val="20"/>
+          <w:szCs w:val="20"/>
+          <w:highlight w:val="none"/>
+          <w:shd w:fill="FFFFFF" w:val="clear"/>
+        </w:rPr>
+      </w:pPr>
+      <w:r>
+        <w:rPr>
+          <w:rFonts w:ascii="Courier new" w:hAnsi="Courier new"/>
+          <w:b w:val="false"/>
+          <w:color w:val="000000"/>
+          <w:sz w:val="20"/>
+          <w:szCs w:val="20"/>
+          <w:shd w:fill="FFFFFF" w:val="clear"/>
+        </w:rPr>
+        <w:t>"server": server_count</w:t>
+      </w:r>
+    </w:p>
+    <w:p>
+      <w:pPr>
+        <w:pStyle w:val="Normal"/>
+        <w:spacing w:lineRule="atLeast" w:line="285"/>
+        <w:ind w:hanging="0" w:left="0" w:right="0"/>
+        <w:rPr>
+          <w:rFonts w:ascii="Courier new" w:hAnsi="Courier new"/>
+          <w:b w:val="false"/>
+          <w:color w:val="000000"/>
+          <w:sz w:val="20"/>
+          <w:szCs w:val="20"/>
+          <w:highlight w:val="none"/>
+          <w:shd w:fill="FFFFFF" w:val="clear"/>
+        </w:rPr>
+      </w:pPr>
+      <w:r>
+        <w:rPr>
+          <w:rFonts w:ascii="Courier new" w:hAnsi="Courier new"/>
+          <w:b w:val="false"/>
+          <w:color w:val="000000"/>
+          <w:sz w:val="20"/>
+          <w:szCs w:val="20"/>
+          <w:shd w:fill="FFFFFF" w:val="clear"/>
+        </w:rPr>
+        <w:t>})</w:t>
+      </w:r>
+    </w:p>
+    <w:p>
+      <w:pPr>
+        <w:pStyle w:val="Normal"/>
+        <w:spacing w:lineRule="atLeast" w:line="285"/>
+        <w:ind w:hanging="0" w:left="0" w:right="0"/>
+        <w:rPr>
+          <w:rFonts w:ascii="Courier new" w:hAnsi="Courier new"/>
+          <w:b w:val="false"/>
+          <w:color w:val="000000"/>
+          <w:sz w:val="20"/>
+          <w:szCs w:val="20"/>
+          <w:highlight w:val="none"/>
+          <w:shd w:fill="FFFFFF" w:val="clear"/>
+        </w:rPr>
+      </w:pPr>
+      <w:r>
+        <w:rPr>
+          <w:rFonts w:ascii="Courier new" w:hAnsi="Courier new"/>
+          <w:b w:val="false"/>
+          <w:color w:val="000000"/>
+          <w:sz w:val="20"/>
+          <w:szCs w:val="20"/>
+          <w:shd w:fill="FFFFFF" w:val="clear"/>
+        </w:rPr>
+      </w:r>
+    </w:p>
+    <w:p>
+      <w:pPr>
+        <w:pStyle w:val="Normal"/>
+        <w:spacing w:lineRule="atLeast" w:line="285"/>
+        <w:ind w:hanging="0" w:left="0" w:right="0"/>
+        <w:rPr>
+          <w:rFonts w:ascii="Courier new" w:hAnsi="Courier new"/>
+          <w:b w:val="false"/>
+          <w:color w:val="000000"/>
+          <w:sz w:val="20"/>
+          <w:szCs w:val="20"/>
+          <w:highlight w:val="none"/>
+          <w:shd w:fill="FFFFFF" w:val="clear"/>
+        </w:rPr>
+      </w:pPr>
+      <w:r>
+        <w:rPr>
+          <w:rFonts w:ascii="Courier new" w:hAnsi="Courier new"/>
+          <w:b w:val="false"/>
+          <w:color w:val="000000"/>
+          <w:sz w:val="20"/>
+          <w:szCs w:val="20"/>
+          <w:shd w:fill="FFFFFF" w:val="clear"/>
+        </w:rPr>
+        <w:t>response = requests.get(</w:t>
+      </w:r>
+    </w:p>
+    <w:p>
+      <w:pPr>
+        <w:pStyle w:val="Normal"/>
+        <w:spacing w:lineRule="atLeast" w:line="285"/>
+        <w:ind w:hanging="0" w:left="0" w:right="0"/>
+        <w:rPr>
+          <w:rFonts w:ascii="Courier new" w:hAnsi="Courier new"/>
+          <w:b w:val="false"/>
+          <w:color w:val="000000"/>
+          <w:sz w:val="20"/>
+          <w:szCs w:val="20"/>
+          <w:highlight w:val="none"/>
+          <w:shd w:fill="FFFFFF" w:val="clear"/>
+        </w:rPr>
+      </w:pPr>
+      <w:r>
+        <w:rPr>
+          <w:rFonts w:ascii="Courier new" w:hAnsi="Courier new"/>
+          <w:b w:val="false"/>
+          <w:color w:val="000000"/>
+          <w:sz w:val="20"/>
+          <w:szCs w:val="20"/>
+          <w:shd w:fill="FFFFFF" w:val="clear"/>
+        </w:rPr>
+        <w:t>f"{additional_servers[0]['protocol']}://{additional_servers[0]['host']}:{additional_servers[0]['port']}/api/files"</w:t>
+      </w:r>
+    </w:p>
+    <w:p>
+      <w:pPr>
+        <w:pStyle w:val="Normal"/>
+        <w:spacing w:lineRule="atLeast" w:line="285"/>
+        <w:ind w:hanging="0" w:left="0" w:right="0"/>
+        <w:rPr>
+          <w:rFonts w:ascii="Courier new" w:hAnsi="Courier new"/>
+          <w:b w:val="false"/>
+          <w:color w:val="000000"/>
+          <w:sz w:val="20"/>
+          <w:szCs w:val="20"/>
+          <w:highlight w:val="none"/>
+          <w:shd w:fill="FFFFFF" w:val="clear"/>
+        </w:rPr>
+      </w:pPr>
+      <w:r>
+        <w:rPr>
+          <w:rFonts w:ascii="Courier new" w:hAnsi="Courier new"/>
+          <w:b w:val="false"/>
+          <w:color w:val="000000"/>
+          <w:sz w:val="20"/>
+          <w:szCs w:val="20"/>
+          <w:shd w:fill="FFFFFF" w:val="clear"/>
+        </w:rPr>
+        <w:t>)</w:t>
+      </w:r>
+    </w:p>
+    <w:p>
+      <w:pPr>
+        <w:pStyle w:val="Normal"/>
+        <w:spacing w:lineRule="atLeast" w:line="285"/>
+        <w:ind w:hanging="0" w:left="0" w:right="0"/>
+        <w:rPr>
+          <w:rFonts w:ascii="Courier new" w:hAnsi="Courier new"/>
+          <w:b w:val="false"/>
+          <w:color w:val="000000"/>
+          <w:sz w:val="20"/>
+          <w:szCs w:val="20"/>
+          <w:highlight w:val="none"/>
+          <w:shd w:fill="FFFFFF" w:val="clear"/>
+        </w:rPr>
+      </w:pPr>
+      <w:r>
+        <w:rPr>
+          <w:rFonts w:ascii="Courier new" w:hAnsi="Courier new"/>
+          <w:b w:val="false"/>
+          <w:color w:val="000000"/>
+          <w:sz w:val="20"/>
+          <w:szCs w:val="20"/>
+          <w:shd w:fill="FFFFFF" w:val="clear"/>
+        </w:rPr>
+        <w:t>if response.status_code == 200:</w:t>
+      </w:r>
+    </w:p>
+    <w:p>
+      <w:pPr>
+        <w:pStyle w:val="Normal"/>
+        <w:spacing w:lineRule="atLeast" w:line="285"/>
+        <w:ind w:hanging="0" w:left="0" w:right="0"/>
+        <w:rPr>
+          <w:rFonts w:ascii="Courier new" w:hAnsi="Courier new"/>
+          <w:b w:val="false"/>
+          <w:color w:val="000000"/>
+          <w:sz w:val="20"/>
+          <w:szCs w:val="20"/>
+          <w:highlight w:val="none"/>
+          <w:shd w:fill="FFFFFF" w:val="clear"/>
+        </w:rPr>
+      </w:pPr>
+      <w:r>
+        <w:rPr>
+          <w:rFonts w:ascii="Courier new" w:hAnsi="Courier new"/>
+          <w:b w:val="false"/>
+          <w:color w:val="000000"/>
+          <w:sz w:val="20"/>
+          <w:szCs w:val="20"/>
+          <w:shd w:fill="FFFFFF" w:val="clear"/>
+        </w:rPr>
+        <w:t>files.extend(response.json()["files"])</w:t>
+      </w:r>
+    </w:p>
+    <w:p>
+      <w:pPr>
+        <w:pStyle w:val="Normal"/>
+        <w:spacing w:lineRule="atLeast" w:line="285"/>
+        <w:ind w:hanging="0" w:left="0" w:right="0"/>
+        <w:rPr>
+          <w:rFonts w:ascii="Courier new" w:hAnsi="Courier new"/>
+          <w:b w:val="false"/>
+          <w:color w:val="000000"/>
+          <w:sz w:val="20"/>
+          <w:szCs w:val="20"/>
+          <w:highlight w:val="none"/>
+          <w:shd w:fill="FFFFFF" w:val="clear"/>
+        </w:rPr>
+      </w:pPr>
+      <w:r>
+        <w:rPr>
+          <w:rFonts w:ascii="Courier new" w:hAnsi="Courier new"/>
+          <w:b w:val="false"/>
+          <w:color w:val="000000"/>
+          <w:sz w:val="20"/>
+          <w:szCs w:val="20"/>
+          <w:shd w:fill="FFFFFF" w:val="clear"/>
+        </w:rPr>
+      </w:r>
+    </w:p>
+    <w:p>
+      <w:pPr>
+        <w:pStyle w:val="Normal"/>
+        <w:spacing w:lineRule="atLeast" w:line="285"/>
+        <w:ind w:hanging="0" w:left="0" w:right="0"/>
+        <w:rPr>
+          <w:rFonts w:ascii="Courier new" w:hAnsi="Courier new"/>
+          <w:b w:val="false"/>
+          <w:color w:val="000000"/>
+          <w:sz w:val="20"/>
+          <w:szCs w:val="20"/>
+          <w:highlight w:val="none"/>
+          <w:shd w:fill="FFFFFF" w:val="clear"/>
+        </w:rPr>
+      </w:pPr>
+      <w:r>
+        <w:rPr>
+          <w:rFonts w:ascii="Courier new" w:hAnsi="Courier new"/>
+          <w:b w:val="false"/>
+          <w:color w:val="000000"/>
+          <w:sz w:val="20"/>
+          <w:szCs w:val="20"/>
+          <w:shd w:fill="FFFFFF" w:val="clear"/>
+        </w:rPr>
+        <w:t>return {"files": files}</w:t>
+      </w:r>
+    </w:p>
+    <w:p>
+      <w:pPr>
+        <w:pStyle w:val="Normal"/>
+        <w:spacing w:lineRule="atLeast" w:line="285"/>
+        <w:ind w:hanging="0" w:left="0" w:right="0"/>
+        <w:rPr>
+          <w:rFonts w:ascii="Courier new" w:hAnsi="Courier new"/>
+          <w:b w:val="false"/>
+          <w:color w:val="000000"/>
+          <w:sz w:val="20"/>
+          <w:szCs w:val="20"/>
+          <w:highlight w:val="none"/>
+          <w:shd w:fill="FFFFFF" w:val="clear"/>
+        </w:rPr>
+      </w:pPr>
+      <w:r>
+        <w:rPr>
+          <w:rFonts w:ascii="Courier new" w:hAnsi="Courier new"/>
+          <w:b w:val="false"/>
+          <w:color w:val="000000"/>
+          <w:sz w:val="20"/>
+          <w:szCs w:val="20"/>
+          <w:shd w:fill="FFFFFF" w:val="clear"/>
+        </w:rPr>
+      </w:r>
+    </w:p>
+    <w:p>
+      <w:pPr>
+        <w:pStyle w:val="Normal"/>
+        <w:spacing w:lineRule="atLeast" w:line="285"/>
+        <w:ind w:hanging="0" w:left="0" w:right="0"/>
+        <w:rPr>
+          <w:rFonts w:ascii="Courier new" w:hAnsi="Courier new"/>
+          <w:b w:val="false"/>
+          <w:color w:val="000000"/>
+          <w:sz w:val="20"/>
+          <w:szCs w:val="20"/>
+          <w:highlight w:val="none"/>
+          <w:shd w:fill="FFFFFF" w:val="clear"/>
+        </w:rPr>
+      </w:pPr>
+      <w:r>
+        <w:rPr>
+          <w:rFonts w:ascii="Courier new" w:hAnsi="Courier new"/>
+          <w:b w:val="false"/>
+          <w:color w:val="000000"/>
+          <w:sz w:val="20"/>
+          <w:szCs w:val="20"/>
+          <w:shd w:fill="FFFFFF" w:val="clear"/>
+        </w:rPr>
+        <w:t>@application.get("/api/files/{item_name}")</w:t>
+      </w:r>
+    </w:p>
+    <w:p>
+      <w:pPr>
+        <w:pStyle w:val="Normal"/>
+        <w:spacing w:lineRule="atLeast" w:line="285"/>
+        <w:ind w:hanging="0" w:left="0" w:right="0"/>
+        <w:rPr>
+          <w:rFonts w:ascii="Courier new" w:hAnsi="Courier new"/>
+          <w:b w:val="false"/>
+          <w:color w:val="000000"/>
+          <w:sz w:val="20"/>
+          <w:szCs w:val="20"/>
+          <w:highlight w:val="none"/>
+          <w:shd w:fill="FFFFFF" w:val="clear"/>
+        </w:rPr>
+      </w:pPr>
+      <w:r>
+        <w:rPr>
+          <w:rFonts w:ascii="Courier new" w:hAnsi="Courier new"/>
+          <w:b w:val="false"/>
+          <w:color w:val="000000"/>
+          <w:sz w:val="20"/>
+          <w:szCs w:val="20"/>
+          <w:shd w:fill="FFFFFF" w:val="clear"/>
+        </w:rPr>
+        <w:t>def getFileByName(item_name: str):</w:t>
+      </w:r>
+    </w:p>
+    <w:p>
+      <w:pPr>
+        <w:pStyle w:val="Normal"/>
+        <w:spacing w:lineRule="atLeast" w:line="285"/>
+        <w:ind w:hanging="0" w:left="0" w:right="0"/>
+        <w:rPr>
+          <w:rFonts w:ascii="Courier new" w:hAnsi="Courier new"/>
+          <w:b w:val="false"/>
+          <w:color w:val="000000"/>
+          <w:sz w:val="20"/>
+          <w:szCs w:val="20"/>
+          <w:highlight w:val="none"/>
+          <w:shd w:fill="FFFFFF" w:val="clear"/>
+        </w:rPr>
+      </w:pPr>
+      <w:r>
+        <w:rPr>
+          <w:rFonts w:ascii="Courier new" w:hAnsi="Courier new"/>
+          <w:b w:val="false"/>
+          <w:color w:val="000000"/>
+          <w:sz w:val="20"/>
+          <w:szCs w:val="20"/>
+          <w:shd w:fill="FFFFFF" w:val="clear"/>
+        </w:rPr>
+        <w:t>file_path = os.path.join(files_dir, item_name)</w:t>
+      </w:r>
+    </w:p>
+    <w:p>
+      <w:pPr>
+        <w:pStyle w:val="Normal"/>
+        <w:spacing w:lineRule="atLeast" w:line="285"/>
+        <w:ind w:hanging="0" w:left="0" w:right="0"/>
+        <w:rPr>
+          <w:rFonts w:ascii="Courier new" w:hAnsi="Courier new"/>
+          <w:b w:val="false"/>
+          <w:color w:val="000000"/>
+          <w:sz w:val="20"/>
+          <w:szCs w:val="20"/>
+          <w:highlight w:val="none"/>
+          <w:shd w:fill="FFFFFF" w:val="clear"/>
+        </w:rPr>
+      </w:pPr>
+      <w:r>
+        <w:rPr>
+          <w:rFonts w:ascii="Courier new" w:hAnsi="Courier new"/>
+          <w:b w:val="false"/>
+          <w:color w:val="000000"/>
+          <w:sz w:val="20"/>
+          <w:szCs w:val="20"/>
+          <w:shd w:fill="FFFFFF" w:val="clear"/>
+        </w:rPr>
+      </w:r>
+    </w:p>
+    <w:p>
+      <w:pPr>
+        <w:pStyle w:val="Normal"/>
+        <w:spacing w:lineRule="atLeast" w:line="285"/>
+        <w:ind w:hanging="0" w:left="0" w:right="0"/>
+        <w:rPr>
+          <w:rFonts w:ascii="Courier new" w:hAnsi="Courier new"/>
+          <w:b w:val="false"/>
+          <w:color w:val="000000"/>
+          <w:sz w:val="20"/>
+          <w:szCs w:val="20"/>
+          <w:highlight w:val="none"/>
+          <w:shd w:fill="FFFFFF" w:val="clear"/>
+        </w:rPr>
+      </w:pPr>
+      <w:r>
+        <w:rPr>
+          <w:rFonts w:ascii="Courier new" w:hAnsi="Courier new"/>
+          <w:b w:val="false"/>
+          <w:color w:val="000000"/>
+          <w:sz w:val="20"/>
+          <w:szCs w:val="20"/>
+          <w:shd w:fill="FFFFFF" w:val="clear"/>
+        </w:rPr>
+        <w:t>if os.path.isfile(file_path):</w:t>
+      </w:r>
+    </w:p>
+    <w:p>
+      <w:pPr>
+        <w:pStyle w:val="Normal"/>
+        <w:spacing w:lineRule="atLeast" w:line="285"/>
+        <w:ind w:hanging="0" w:left="0" w:right="0"/>
+        <w:rPr>
+          <w:rFonts w:ascii="Courier new" w:hAnsi="Courier new"/>
+          <w:b w:val="false"/>
+          <w:color w:val="000000"/>
+          <w:sz w:val="20"/>
+          <w:szCs w:val="20"/>
+          <w:highlight w:val="none"/>
+          <w:shd w:fill="FFFFFF" w:val="clear"/>
+        </w:rPr>
+      </w:pPr>
+      <w:r>
+        <w:rPr>
+          <w:rFonts w:ascii="Courier new" w:hAnsi="Courier new"/>
+          <w:b w:val="false"/>
+          <w:color w:val="000000"/>
+          <w:sz w:val="20"/>
+          <w:szCs w:val="20"/>
+          <w:shd w:fill="FFFFFF" w:val="clear"/>
+        </w:rPr>
+        <w:t>return FileResponse(</w:t>
+      </w:r>
+    </w:p>
+    <w:p>
+      <w:pPr>
+        <w:pStyle w:val="Normal"/>
+        <w:spacing w:lineRule="atLeast" w:line="285"/>
+        <w:ind w:hanging="0" w:left="0" w:right="0"/>
+        <w:rPr>
+          <w:rFonts w:ascii="Courier new" w:hAnsi="Courier new"/>
+          <w:b w:val="false"/>
+          <w:color w:val="000000"/>
+          <w:sz w:val="20"/>
+          <w:szCs w:val="20"/>
+          <w:highlight w:val="none"/>
+          <w:shd w:fill="FFFFFF" w:val="clear"/>
+        </w:rPr>
+      </w:pPr>
+      <w:r>
+        <w:rPr>
+          <w:rFonts w:ascii="Courier new" w:hAnsi="Courier new"/>
+          <w:b w:val="false"/>
+          <w:color w:val="000000"/>
+          <w:sz w:val="20"/>
+          <w:szCs w:val="20"/>
+          <w:shd w:fill="FFFFFF" w:val="clear"/>
+        </w:rPr>
+        <w:t>path = file_path,</w:t>
+      </w:r>
+    </w:p>
+    <w:p>
+      <w:pPr>
+        <w:pStyle w:val="Normal"/>
+        <w:spacing w:lineRule="atLeast" w:line="285"/>
+        <w:ind w:hanging="0" w:left="0" w:right="0"/>
+        <w:rPr>
+          <w:rFonts w:ascii="Courier new" w:hAnsi="Courier new"/>
+          <w:b w:val="false"/>
+          <w:color w:val="000000"/>
+          <w:sz w:val="20"/>
+          <w:szCs w:val="20"/>
+          <w:highlight w:val="none"/>
+          <w:shd w:fill="FFFFFF" w:val="clear"/>
+        </w:rPr>
+      </w:pPr>
+      <w:r>
+        <w:rPr>
+          <w:rFonts w:ascii="Courier new" w:hAnsi="Courier new"/>
+          <w:b w:val="false"/>
+          <w:color w:val="000000"/>
+          <w:sz w:val="20"/>
+          <w:szCs w:val="20"/>
+          <w:shd w:fill="FFFFFF" w:val="clear"/>
+        </w:rPr>
+        <w:t>filename = item_name,</w:t>
+      </w:r>
+    </w:p>
+    <w:p>
+      <w:pPr>
+        <w:pStyle w:val="Normal"/>
+        <w:spacing w:lineRule="atLeast" w:line="285"/>
+        <w:ind w:hanging="0" w:left="0" w:right="0"/>
+        <w:rPr>
+          <w:rFonts w:ascii="Courier new" w:hAnsi="Courier new"/>
+          <w:b w:val="false"/>
+          <w:color w:val="000000"/>
+          <w:sz w:val="20"/>
+          <w:szCs w:val="20"/>
+          <w:highlight w:val="none"/>
+          <w:shd w:fill="FFFFFF" w:val="clear"/>
+        </w:rPr>
+      </w:pPr>
+      <w:r>
+        <w:rPr>
+          <w:rFonts w:ascii="Courier new" w:hAnsi="Courier new"/>
+          <w:b w:val="false"/>
+          <w:color w:val="000000"/>
+          <w:sz w:val="20"/>
+          <w:szCs w:val="20"/>
+          <w:shd w:fill="FFFFFF" w:val="clear"/>
+        </w:rPr>
+        <w:t>media_type="application/octet-stream"</w:t>
+      </w:r>
+    </w:p>
+    <w:p>
+      <w:pPr>
+        <w:pStyle w:val="Normal"/>
+        <w:spacing w:lineRule="atLeast" w:line="285"/>
+        <w:ind w:hanging="0" w:left="0" w:right="0"/>
+        <w:rPr>
+          <w:rFonts w:ascii="Courier new" w:hAnsi="Courier new"/>
+          <w:b w:val="false"/>
+          <w:color w:val="000000"/>
+          <w:sz w:val="20"/>
+          <w:szCs w:val="20"/>
+          <w:highlight w:val="none"/>
+          <w:shd w:fill="FFFFFF" w:val="clear"/>
+        </w:rPr>
+      </w:pPr>
+      <w:r>
+        <w:rPr>
+          <w:rFonts w:ascii="Courier new" w:hAnsi="Courier new"/>
+          <w:b w:val="false"/>
+          <w:color w:val="000000"/>
+          <w:sz w:val="20"/>
+          <w:szCs w:val="20"/>
+          <w:shd w:fill="FFFFFF" w:val="clear"/>
+        </w:rPr>
+        <w:t>)</w:t>
+      </w:r>
+    </w:p>
+    <w:p>
+      <w:pPr>
+        <w:pStyle w:val="Normal"/>
+        <w:spacing w:lineRule="atLeast" w:line="285"/>
+        <w:ind w:hanging="0" w:left="0" w:right="0"/>
+        <w:rPr>
+          <w:rFonts w:ascii="Courier new" w:hAnsi="Courier new"/>
+          <w:b w:val="false"/>
+          <w:color w:val="000000"/>
+          <w:sz w:val="20"/>
+          <w:szCs w:val="20"/>
+          <w:highlight w:val="none"/>
+          <w:shd w:fill="FFFFFF" w:val="clear"/>
+        </w:rPr>
+      </w:pPr>
+      <w:r>
+        <w:rPr>
+          <w:rFonts w:ascii="Courier new" w:hAnsi="Courier new"/>
+          <w:b w:val="false"/>
+          <w:color w:val="000000"/>
+          <w:sz w:val="20"/>
+          <w:szCs w:val="20"/>
+          <w:shd w:fill="FFFFFF" w:val="clear"/>
+        </w:rPr>
+      </w:r>
+    </w:p>
+    <w:p>
+      <w:pPr>
+        <w:pStyle w:val="Normal"/>
+        <w:spacing w:lineRule="atLeast" w:line="285"/>
+        <w:ind w:hanging="0" w:left="0" w:right="0"/>
+        <w:rPr>
+          <w:rFonts w:ascii="Courier new" w:hAnsi="Courier new"/>
+          <w:b w:val="false"/>
+          <w:color w:val="000000"/>
+          <w:sz w:val="20"/>
+          <w:szCs w:val="20"/>
+          <w:highlight w:val="none"/>
+          <w:shd w:fill="FFFFFF" w:val="clear"/>
+        </w:rPr>
+      </w:pPr>
+      <w:r>
+        <w:rPr>
+          <w:rFonts w:ascii="Courier new" w:hAnsi="Courier new"/>
+          <w:b w:val="false"/>
+          <w:color w:val="000000"/>
+          <w:sz w:val="20"/>
+          <w:szCs w:val="20"/>
+          <w:shd w:fill="FFFFFF" w:val="clear"/>
+        </w:rPr>
+        <w:t>response = requests.get(</w:t>
+      </w:r>
+    </w:p>
+    <w:p>
+      <w:pPr>
+        <w:pStyle w:val="Normal"/>
+        <w:spacing w:lineRule="atLeast" w:line="285"/>
+        <w:ind w:hanging="0" w:left="0" w:right="0"/>
+        <w:rPr>
+          <w:rFonts w:ascii="Courier new" w:hAnsi="Courier new"/>
+          <w:b w:val="false"/>
+          <w:color w:val="000000"/>
+          <w:sz w:val="20"/>
+          <w:szCs w:val="20"/>
+          <w:highlight w:val="none"/>
+          <w:shd w:fill="FFFFFF" w:val="clear"/>
+        </w:rPr>
+      </w:pPr>
+      <w:r>
+        <w:rPr>
+          <w:rFonts w:ascii="Courier new" w:hAnsi="Courier new"/>
+          <w:b w:val="false"/>
+          <w:color w:val="000000"/>
+          <w:sz w:val="20"/>
+          <w:szCs w:val="20"/>
+          <w:shd w:fill="FFFFFF" w:val="clear"/>
+        </w:rPr>
+        <w:t>f"{additional_servers[0]['protocol']}://{additional_servers[0]['host']}:{additional_servers[0]['port']}/api/files/{item_name}",</w:t>
+      </w:r>
+    </w:p>
+    <w:p>
+      <w:pPr>
+        <w:pStyle w:val="Normal"/>
+        <w:spacing w:lineRule="atLeast" w:line="285"/>
+        <w:ind w:hanging="0" w:left="0" w:right="0"/>
+        <w:rPr>
+          <w:rFonts w:ascii="Courier new" w:hAnsi="Courier new"/>
+          <w:b w:val="false"/>
+          <w:color w:val="000000"/>
+          <w:sz w:val="20"/>
+          <w:szCs w:val="20"/>
+          <w:highlight w:val="none"/>
+          <w:shd w:fill="FFFFFF" w:val="clear"/>
+        </w:rPr>
+      </w:pPr>
+      <w:r>
+        <w:rPr>
+          <w:rFonts w:ascii="Courier new" w:hAnsi="Courier new"/>
+          <w:b w:val="false"/>
+          <w:color w:val="000000"/>
+          <w:sz w:val="20"/>
+          <w:szCs w:val="20"/>
+          <w:shd w:fill="FFFFFF" w:val="clear"/>
+        </w:rPr>
+        <w:t>stream=True</w:t>
+      </w:r>
+    </w:p>
+    <w:p>
+      <w:pPr>
+        <w:pStyle w:val="Normal"/>
+        <w:spacing w:lineRule="atLeast" w:line="285"/>
+        <w:ind w:hanging="0" w:left="0" w:right="0"/>
+        <w:rPr>
+          <w:rFonts w:ascii="Courier new" w:hAnsi="Courier new"/>
+          <w:b w:val="false"/>
+          <w:color w:val="000000"/>
+          <w:sz w:val="20"/>
+          <w:szCs w:val="20"/>
+          <w:highlight w:val="none"/>
+          <w:shd w:fill="FFFFFF" w:val="clear"/>
+        </w:rPr>
+      </w:pPr>
+      <w:r>
+        <w:rPr>
+          <w:rFonts w:ascii="Courier new" w:hAnsi="Courier new"/>
+          <w:b w:val="false"/>
+          <w:color w:val="000000"/>
+          <w:sz w:val="20"/>
+          <w:szCs w:val="20"/>
+          <w:shd w:fill="FFFFFF" w:val="clear"/>
+        </w:rPr>
+        <w:t>)</w:t>
+      </w:r>
+    </w:p>
+    <w:p>
+      <w:pPr>
+        <w:pStyle w:val="Normal"/>
+        <w:spacing w:lineRule="atLeast" w:line="285"/>
+        <w:ind w:hanging="0" w:left="0" w:right="0"/>
+        <w:rPr>
+          <w:rFonts w:ascii="Courier new" w:hAnsi="Courier new"/>
+          <w:b w:val="false"/>
+          <w:color w:val="000000"/>
+          <w:sz w:val="20"/>
+          <w:szCs w:val="20"/>
+          <w:highlight w:val="none"/>
+          <w:shd w:fill="FFFFFF" w:val="clear"/>
+        </w:rPr>
+      </w:pPr>
+      <w:r>
+        <w:rPr>
+          <w:rFonts w:ascii="Courier new" w:hAnsi="Courier new"/>
+          <w:b w:val="false"/>
+          <w:color w:val="000000"/>
+          <w:sz w:val="20"/>
+          <w:szCs w:val="20"/>
+          <w:shd w:fill="FFFFFF" w:val="clear"/>
+        </w:rPr>
+      </w:r>
+    </w:p>
+    <w:p>
+      <w:pPr>
+        <w:pStyle w:val="Normal"/>
+        <w:spacing w:lineRule="atLeast" w:line="285"/>
+        <w:ind w:hanging="0" w:left="0" w:right="0"/>
+        <w:rPr>
+          <w:rFonts w:ascii="Courier new" w:hAnsi="Courier new"/>
+          <w:b w:val="false"/>
+          <w:color w:val="000000"/>
+          <w:sz w:val="20"/>
+          <w:szCs w:val="20"/>
+          <w:highlight w:val="none"/>
+          <w:shd w:fill="FFFFFF" w:val="clear"/>
+        </w:rPr>
+      </w:pPr>
+      <w:r>
+        <w:rPr>
+          <w:rFonts w:ascii="Courier new" w:hAnsi="Courier new"/>
+          <w:b w:val="false"/>
+          <w:color w:val="000000"/>
+          <w:sz w:val="20"/>
+          <w:szCs w:val="20"/>
+          <w:shd w:fill="FFFFFF" w:val="clear"/>
+        </w:rPr>
+        <w:t>if response.status_code == 200:</w:t>
+      </w:r>
+    </w:p>
+    <w:p>
+      <w:pPr>
+        <w:pStyle w:val="Normal"/>
+        <w:spacing w:lineRule="atLeast" w:line="285"/>
+        <w:ind w:hanging="0" w:left="0" w:right="0"/>
+        <w:rPr>
+          <w:rFonts w:ascii="Courier new" w:hAnsi="Courier new"/>
+          <w:b w:val="false"/>
+          <w:color w:val="000000"/>
+          <w:sz w:val="20"/>
+          <w:szCs w:val="20"/>
+          <w:highlight w:val="none"/>
+          <w:shd w:fill="FFFFFF" w:val="clear"/>
+        </w:rPr>
+      </w:pPr>
+      <w:r>
+        <w:rPr>
+          <w:rFonts w:ascii="Courier new" w:hAnsi="Courier new"/>
+          <w:b w:val="false"/>
+          <w:color w:val="000000"/>
+          <w:sz w:val="20"/>
+          <w:szCs w:val="20"/>
+          <w:shd w:fill="FFFFFF" w:val="clear"/>
+        </w:rPr>
+        <w:t>return StreamingResponse(</w:t>
+      </w:r>
+    </w:p>
+    <w:p>
+      <w:pPr>
+        <w:pStyle w:val="Normal"/>
+        <w:spacing w:lineRule="atLeast" w:line="285"/>
+        <w:ind w:hanging="0" w:left="0" w:right="0"/>
+        <w:rPr>
+          <w:rFonts w:ascii="Courier new" w:hAnsi="Courier new"/>
+          <w:b w:val="false"/>
+          <w:color w:val="000000"/>
+          <w:sz w:val="20"/>
+          <w:szCs w:val="20"/>
+          <w:highlight w:val="none"/>
+          <w:shd w:fill="FFFFFF" w:val="clear"/>
+        </w:rPr>
+      </w:pPr>
+      <w:r>
+        <w:rPr>
+          <w:rFonts w:ascii="Courier new" w:hAnsi="Courier new"/>
+          <w:b w:val="false"/>
+          <w:color w:val="000000"/>
+          <w:sz w:val="20"/>
+          <w:szCs w:val="20"/>
+          <w:shd w:fill="FFFFFF" w:val="clear"/>
+        </w:rPr>
+        <w:t>response.iter_content(chunk_size=8192),</w:t>
+      </w:r>
+    </w:p>
+    <w:p>
+      <w:pPr>
+        <w:pStyle w:val="Normal"/>
+        <w:spacing w:lineRule="atLeast" w:line="285"/>
+        <w:ind w:hanging="0" w:left="0" w:right="0"/>
+        <w:rPr>
+          <w:rFonts w:ascii="Courier new" w:hAnsi="Courier new"/>
+          <w:b w:val="false"/>
+          <w:color w:val="000000"/>
+          <w:sz w:val="20"/>
+          <w:szCs w:val="20"/>
+          <w:highlight w:val="none"/>
+          <w:shd w:fill="FFFFFF" w:val="clear"/>
+        </w:rPr>
+      </w:pPr>
+      <w:r>
+        <w:rPr>
+          <w:rFonts w:ascii="Courier new" w:hAnsi="Courier new"/>
+          <w:b w:val="false"/>
+          <w:color w:val="000000"/>
+          <w:sz w:val="20"/>
+          <w:szCs w:val="20"/>
+          <w:shd w:fill="FFFFFF" w:val="clear"/>
+        </w:rPr>
+        <w:t>media_type=response.headers.get("content-type"),</w:t>
+      </w:r>
+    </w:p>
+    <w:p>
+      <w:pPr>
+        <w:pStyle w:val="Normal"/>
+        <w:spacing w:lineRule="atLeast" w:line="285"/>
+        <w:ind w:hanging="0" w:left="0" w:right="0"/>
+        <w:rPr>
+          <w:rFonts w:ascii="Courier new" w:hAnsi="Courier new"/>
+          <w:b w:val="false"/>
+          <w:color w:val="000000"/>
+          <w:sz w:val="20"/>
+          <w:szCs w:val="20"/>
+          <w:highlight w:val="none"/>
+          <w:shd w:fill="FFFFFF" w:val="clear"/>
+        </w:rPr>
+      </w:pPr>
+      <w:r>
+        <w:rPr>
+          <w:rFonts w:ascii="Courier new" w:hAnsi="Courier new"/>
+          <w:b w:val="false"/>
+          <w:color w:val="000000"/>
+          <w:sz w:val="20"/>
+          <w:szCs w:val="20"/>
+          <w:shd w:fill="FFFFFF" w:val="clear"/>
+        </w:rPr>
+        <w:t>headers={"Content-Disposition": f"attachment; filename={item_name}"}</w:t>
+      </w:r>
+    </w:p>
+    <w:p>
+      <w:pPr>
+        <w:pStyle w:val="Normal"/>
+        <w:spacing w:lineRule="atLeast" w:line="285"/>
+        <w:ind w:hanging="0" w:left="0" w:right="0"/>
+        <w:rPr>
+          <w:rFonts w:ascii="Courier new" w:hAnsi="Courier new"/>
+          <w:b w:val="false"/>
+          <w:color w:val="000000"/>
+          <w:sz w:val="20"/>
+          <w:szCs w:val="20"/>
+          <w:highlight w:val="none"/>
+          <w:shd w:fill="FFFFFF" w:val="clear"/>
+        </w:rPr>
+      </w:pPr>
+      <w:r>
+        <w:rPr>
+          <w:rFonts w:ascii="Courier new" w:hAnsi="Courier new"/>
+          <w:b w:val="false"/>
+          <w:color w:val="000000"/>
+          <w:sz w:val="20"/>
+          <w:szCs w:val="20"/>
+          <w:shd w:fill="FFFFFF" w:val="clear"/>
+        </w:rPr>
+        <w:t>)</w:t>
+      </w:r>
+    </w:p>
+    <w:p>
+      <w:pPr>
+        <w:pStyle w:val="Normal"/>
+        <w:spacing w:lineRule="atLeast" w:line="285"/>
+        <w:ind w:hanging="0" w:left="0" w:right="0"/>
+        <w:rPr>
+          <w:rFonts w:ascii="Courier new" w:hAnsi="Courier new"/>
+          <w:b w:val="false"/>
+          <w:color w:val="000000"/>
+          <w:sz w:val="20"/>
+          <w:szCs w:val="20"/>
+          <w:highlight w:val="none"/>
+          <w:shd w:fill="FFFFFF" w:val="clear"/>
+        </w:rPr>
+      </w:pPr>
+      <w:r>
+        <w:rPr>
+          <w:rFonts w:ascii="Courier new" w:hAnsi="Courier new"/>
+          <w:b w:val="false"/>
+          <w:color w:val="000000"/>
+          <w:sz w:val="20"/>
+          <w:szCs w:val="20"/>
+          <w:shd w:fill="FFFFFF" w:val="clear"/>
+        </w:rPr>
+      </w:r>
+    </w:p>
+    <w:p>
+      <w:pPr>
+        <w:pStyle w:val="Normal"/>
+        <w:spacing w:lineRule="atLeast" w:line="285"/>
+        <w:ind w:hanging="0" w:left="0" w:right="0"/>
+        <w:rPr>
+          <w:rFonts w:ascii="Courier new" w:hAnsi="Courier new"/>
+          <w:b w:val="false"/>
+          <w:color w:val="000000"/>
+          <w:sz w:val="20"/>
+          <w:szCs w:val="20"/>
+          <w:highlight w:val="none"/>
+          <w:shd w:fill="FFFFFF" w:val="clear"/>
+        </w:rPr>
+      </w:pPr>
+      <w:r>
+        <w:rPr>
+          <w:rFonts w:ascii="Courier new" w:hAnsi="Courier new"/>
+          <w:b w:val="false"/>
+          <w:color w:val="000000"/>
+          <w:sz w:val="20"/>
+          <w:szCs w:val="20"/>
+          <w:shd w:fill="FFFFFF" w:val="clear"/>
+        </w:rPr>
+        <w:t>raise HTTPException(status_code=404, detail="File not found")</w:t>
+      </w:r>
+    </w:p>
+    <w:p>
+      <w:pPr>
+        <w:pStyle w:val="Normal"/>
+        <w:spacing w:lineRule="auto" w:line="360"/>
+        <w:ind w:firstLine="709"/>
+        <w:jc w:val="both"/>
+        <w:rPr>
+          <w:sz w:val="28"/>
+        </w:rPr>
+      </w:pPr>
+      <w:r>
         <w:rPr/>
+      </w:r>
+    </w:p>
+    <w:p>
+      <w:pPr>
+        <w:pStyle w:val="Normal"/>
+        <w:spacing w:lineRule="auto" w:line="360"/>
+        <w:ind w:firstLine="709"/>
+        <w:jc w:val="both"/>
+        <w:rPr>
+          <w:sz w:val="28"/>
+        </w:rPr>
+      </w:pPr>
+      <w:r>
+        <w:rPr>
+          <w:sz w:val="28"/>
+        </w:rPr>
+        <w:t xml:space="preserve"> </w:t>
+      </w:r>
+      <w:r>
+        <w:rPr>
+          <w:sz w:val="28"/>
+        </w:rPr>
+        <w:t>Листинг сервера 2:</w:t>
+      </w:r>
+    </w:p>
+    <w:p>
+      <w:pPr>
+        <w:pStyle w:val="Normal"/>
+        <w:spacing w:lineRule="atLeast" w:line="285"/>
+        <w:ind w:hanging="0" w:left="0" w:right="0"/>
+        <w:rPr>
+          <w:rFonts w:ascii="Courier new" w:hAnsi="Courier new"/>
+          <w:b w:val="false"/>
+          <w:sz w:val="20"/>
+          <w:highlight w:val="none"/>
+          <w:shd w:fill="FFFFFF" w:val="clear"/>
+        </w:rPr>
+      </w:pPr>
+      <w:r>
+        <w:rPr>
+          <w:rFonts w:ascii="Courier new" w:hAnsi="Courier new"/>
+          <w:b w:val="false"/>
+          <w:sz w:val="20"/>
+          <w:shd w:fill="FFFFFF" w:val="clear"/>
+        </w:rPr>
+        <w:t>from fastapi import FastAPI, HTTPException</w:t>
+      </w:r>
+    </w:p>
+    <w:p>
+      <w:pPr>
+        <w:pStyle w:val="Normal"/>
+        <w:spacing w:lineRule="atLeast" w:line="285"/>
+        <w:ind w:hanging="0" w:left="0" w:right="0"/>
+        <w:rPr>
+          <w:rFonts w:ascii="Courier new" w:hAnsi="Courier new"/>
+          <w:b w:val="false"/>
+          <w:sz w:val="20"/>
+          <w:highlight w:val="none"/>
+          <w:shd w:fill="FFFFFF" w:val="clear"/>
+        </w:rPr>
+      </w:pPr>
+      <w:r>
+        <w:rPr>
+          <w:rFonts w:ascii="Courier new" w:hAnsi="Courier new"/>
+          <w:b w:val="false"/>
+          <w:sz w:val="20"/>
+          <w:shd w:fill="FFFFFF" w:val="clear"/>
+        </w:rPr>
+        <w:t>from fastapi.responses import FileResponse</w:t>
+      </w:r>
+    </w:p>
+    <w:p>
+      <w:pPr>
+        <w:pStyle w:val="Normal"/>
+        <w:spacing w:lineRule="atLeast" w:line="285"/>
+        <w:ind w:hanging="0" w:left="0" w:right="0"/>
+        <w:rPr>
+          <w:rFonts w:ascii="Courier new" w:hAnsi="Courier new"/>
+          <w:b w:val="false"/>
+          <w:sz w:val="20"/>
+          <w:highlight w:val="none"/>
+          <w:shd w:fill="FFFFFF" w:val="clear"/>
+        </w:rPr>
+      </w:pPr>
+      <w:r>
+        <w:rPr>
+          <w:rFonts w:ascii="Courier new" w:hAnsi="Courier new"/>
+          <w:b w:val="false"/>
+          <w:sz w:val="20"/>
+          <w:shd w:fill="FFFFFF" w:val="clear"/>
+        </w:rPr>
+        <w:t>import os</w:t>
+      </w:r>
+    </w:p>
+    <w:p>
+      <w:pPr>
+        <w:pStyle w:val="Normal"/>
+        <w:spacing w:lineRule="atLeast" w:line="285"/>
+        <w:ind w:hanging="0" w:left="0" w:right="0"/>
+        <w:rPr>
+          <w:rFonts w:ascii="Courier new" w:hAnsi="Courier new"/>
+          <w:b w:val="false"/>
+          <w:sz w:val="20"/>
+          <w:highlight w:val="none"/>
+          <w:shd w:fill="FFFFFF" w:val="clear"/>
+        </w:rPr>
+      </w:pPr>
+      <w:r>
+        <w:rPr>
+          <w:rFonts w:ascii="Courier new" w:hAnsi="Courier new"/>
+          <w:b w:val="false"/>
+          <w:sz w:val="20"/>
+          <w:shd w:fill="FFFFFF" w:val="clear"/>
+        </w:rPr>
+      </w:r>
+    </w:p>
+    <w:p>
+      <w:pPr>
+        <w:pStyle w:val="Normal"/>
+        <w:spacing w:lineRule="atLeast" w:line="285"/>
+        <w:ind w:hanging="0" w:left="0" w:right="0"/>
+        <w:rPr>
+          <w:rFonts w:ascii="Courier new" w:hAnsi="Courier new"/>
+          <w:b w:val="false"/>
+          <w:sz w:val="20"/>
+          <w:highlight w:val="none"/>
+          <w:shd w:fill="FFFFFF" w:val="clear"/>
+        </w:rPr>
+      </w:pPr>
+      <w:r>
+        <w:rPr>
+          <w:rFonts w:ascii="Courier new" w:hAnsi="Courier new"/>
+          <w:b w:val="false"/>
+          <w:sz w:val="20"/>
+          <w:shd w:fill="FFFFFF" w:val="clear"/>
+        </w:rPr>
+        <w:t>application = FastAPI()</w:t>
+      </w:r>
+    </w:p>
+    <w:p>
+      <w:pPr>
+        <w:pStyle w:val="Normal"/>
+        <w:spacing w:lineRule="atLeast" w:line="285"/>
+        <w:ind w:hanging="0" w:left="0" w:right="0"/>
+        <w:rPr>
+          <w:rFonts w:ascii="Courier new" w:hAnsi="Courier new"/>
+          <w:b w:val="false"/>
+          <w:sz w:val="20"/>
+          <w:highlight w:val="none"/>
+          <w:shd w:fill="FFFFFF" w:val="clear"/>
+        </w:rPr>
+      </w:pPr>
+      <w:r>
+        <w:rPr>
+          <w:rFonts w:ascii="Courier new" w:hAnsi="Courier new"/>
+          <w:b w:val="false"/>
+          <w:sz w:val="20"/>
+          <w:shd w:fill="FFFFFF" w:val="clear"/>
+        </w:rPr>
+      </w:r>
+    </w:p>
+    <w:p>
+      <w:pPr>
+        <w:pStyle w:val="Normal"/>
+        <w:spacing w:lineRule="atLeast" w:line="285"/>
+        <w:ind w:hanging="0" w:left="0" w:right="0"/>
+        <w:rPr>
+          <w:rFonts w:ascii="Courier new" w:hAnsi="Courier new"/>
+          <w:b w:val="false"/>
+          <w:sz w:val="20"/>
+          <w:highlight w:val="none"/>
+          <w:shd w:fill="FFFFFF" w:val="clear"/>
+        </w:rPr>
+      </w:pPr>
+      <w:r>
+        <w:rPr>
+          <w:rFonts w:ascii="Courier new" w:hAnsi="Courier new"/>
+          <w:b w:val="false"/>
+          <w:sz w:val="20"/>
+          <w:shd w:fill="FFFFFF" w:val="clear"/>
+        </w:rPr>
+        <w:t>files_dir = f"{os.getcwd()}/secondServer/files/"</w:t>
+      </w:r>
+    </w:p>
+    <w:p>
+      <w:pPr>
+        <w:pStyle w:val="Normal"/>
+        <w:spacing w:lineRule="atLeast" w:line="285"/>
+        <w:ind w:hanging="0" w:left="0" w:right="0"/>
+        <w:rPr>
+          <w:rFonts w:ascii="Courier new" w:hAnsi="Courier new"/>
+          <w:b w:val="false"/>
+          <w:sz w:val="20"/>
+          <w:highlight w:val="none"/>
+          <w:shd w:fill="FFFFFF" w:val="clear"/>
+        </w:rPr>
+      </w:pPr>
+      <w:r>
+        <w:rPr>
+          <w:rFonts w:ascii="Courier new" w:hAnsi="Courier new"/>
+          <w:b w:val="false"/>
+          <w:sz w:val="20"/>
+          <w:shd w:fill="FFFFFF" w:val="clear"/>
+        </w:rPr>
+        <w:t>server_count = "second"</w:t>
+      </w:r>
+    </w:p>
+    <w:p>
+      <w:pPr>
+        <w:pStyle w:val="Normal"/>
+        <w:spacing w:lineRule="atLeast" w:line="285"/>
+        <w:ind w:hanging="0" w:left="0" w:right="0"/>
+        <w:rPr>
+          <w:rFonts w:ascii="Courier new" w:hAnsi="Courier new"/>
+          <w:b w:val="false"/>
+          <w:sz w:val="20"/>
+          <w:highlight w:val="none"/>
+          <w:shd w:fill="FFFFFF" w:val="clear"/>
+        </w:rPr>
+      </w:pPr>
+      <w:r>
+        <w:rPr>
+          <w:rFonts w:ascii="Courier new" w:hAnsi="Courier new"/>
+          <w:b w:val="false"/>
+          <w:sz w:val="20"/>
+          <w:shd w:fill="FFFFFF" w:val="clear"/>
+        </w:rPr>
+      </w:r>
+    </w:p>
+    <w:p>
+      <w:pPr>
+        <w:pStyle w:val="Normal"/>
+        <w:spacing w:lineRule="atLeast" w:line="285"/>
+        <w:ind w:hanging="0" w:left="0" w:right="0"/>
+        <w:rPr>
+          <w:rFonts w:ascii="Courier new" w:hAnsi="Courier new"/>
+          <w:b w:val="false"/>
+          <w:sz w:val="20"/>
+          <w:highlight w:val="none"/>
+          <w:shd w:fill="FFFFFF" w:val="clear"/>
+        </w:rPr>
+      </w:pPr>
+      <w:r>
+        <w:rPr>
+          <w:rFonts w:ascii="Courier new" w:hAnsi="Courier new"/>
+          <w:b w:val="false"/>
+          <w:sz w:val="20"/>
+          <w:shd w:fill="FFFFFF" w:val="clear"/>
+        </w:rPr>
+        <w:t>@application.get("/api/files")</w:t>
+      </w:r>
+    </w:p>
+    <w:p>
+      <w:pPr>
+        <w:pStyle w:val="Normal"/>
+        <w:spacing w:lineRule="atLeast" w:line="285"/>
+        <w:ind w:hanging="0" w:left="0" w:right="0"/>
+        <w:rPr>
+          <w:rFonts w:ascii="Courier new" w:hAnsi="Courier new"/>
+          <w:b w:val="false"/>
+          <w:sz w:val="20"/>
+          <w:highlight w:val="none"/>
+          <w:shd w:fill="FFFFFF" w:val="clear"/>
+        </w:rPr>
+      </w:pPr>
+      <w:r>
+        <w:rPr>
+          <w:rFonts w:ascii="Courier new" w:hAnsi="Courier new"/>
+          <w:b w:val="false"/>
+          <w:sz w:val="20"/>
+          <w:shd w:fill="FFFFFF" w:val="clear"/>
+        </w:rPr>
+        <w:t>def getAllFiles():</w:t>
+      </w:r>
+    </w:p>
+    <w:p>
+      <w:pPr>
+        <w:pStyle w:val="Normal"/>
+        <w:spacing w:lineRule="atLeast" w:line="285"/>
+        <w:ind w:hanging="0" w:left="0" w:right="0"/>
+        <w:rPr>
+          <w:rFonts w:ascii="Courier new" w:hAnsi="Courier new"/>
+          <w:b w:val="false"/>
+          <w:sz w:val="20"/>
+          <w:highlight w:val="none"/>
+          <w:shd w:fill="FFFFFF" w:val="clear"/>
+        </w:rPr>
+      </w:pPr>
+      <w:r>
+        <w:rPr>
+          <w:rFonts w:ascii="Courier new" w:hAnsi="Courier new"/>
+          <w:b w:val="false"/>
+          <w:sz w:val="20"/>
+          <w:shd w:fill="FFFFFF" w:val="clear"/>
+        </w:rPr>
+        <w:t>files = []</w:t>
+      </w:r>
+    </w:p>
+    <w:p>
+      <w:pPr>
+        <w:pStyle w:val="Normal"/>
+        <w:spacing w:lineRule="atLeast" w:line="285"/>
+        <w:ind w:hanging="0" w:left="0" w:right="0"/>
+        <w:rPr>
+          <w:rFonts w:ascii="Courier new" w:hAnsi="Courier new"/>
+          <w:b w:val="false"/>
+          <w:sz w:val="20"/>
+          <w:highlight w:val="none"/>
+          <w:shd w:fill="FFFFFF" w:val="clear"/>
+        </w:rPr>
+      </w:pPr>
+      <w:r>
+        <w:rPr>
+          <w:rFonts w:ascii="Courier new" w:hAnsi="Courier new"/>
+          <w:b w:val="false"/>
+          <w:sz w:val="20"/>
+          <w:shd w:fill="FFFFFF" w:val="clear"/>
+        </w:rPr>
+        <w:t>for filename in os.listdir(files_dir):</w:t>
+      </w:r>
+    </w:p>
+    <w:p>
+      <w:pPr>
+        <w:pStyle w:val="Normal"/>
+        <w:spacing w:lineRule="atLeast" w:line="285"/>
+        <w:ind w:hanging="0" w:left="0" w:right="0"/>
+        <w:rPr>
+          <w:rFonts w:ascii="Courier new" w:hAnsi="Courier new"/>
+          <w:b w:val="false"/>
+          <w:sz w:val="20"/>
+          <w:highlight w:val="none"/>
+          <w:shd w:fill="FFFFFF" w:val="clear"/>
+        </w:rPr>
+      </w:pPr>
+      <w:r>
+        <w:rPr>
+          <w:rFonts w:ascii="Courier new" w:hAnsi="Courier new"/>
+          <w:b w:val="false"/>
+          <w:sz w:val="20"/>
+          <w:shd w:fill="FFFFFF" w:val="clear"/>
+        </w:rPr>
+        <w:t>filepath = f"{files_dir}/{filename}"</w:t>
+      </w:r>
+    </w:p>
+    <w:p>
+      <w:pPr>
+        <w:pStyle w:val="Normal"/>
+        <w:spacing w:lineRule="atLeast" w:line="285"/>
+        <w:ind w:hanging="0" w:left="0" w:right="0"/>
+        <w:rPr>
+          <w:rFonts w:ascii="Courier new" w:hAnsi="Courier new"/>
+          <w:b w:val="false"/>
+          <w:sz w:val="20"/>
+          <w:highlight w:val="none"/>
+          <w:shd w:fill="FFFFFF" w:val="clear"/>
+        </w:rPr>
+      </w:pPr>
+      <w:r>
+        <w:rPr>
+          <w:rFonts w:ascii="Courier new" w:hAnsi="Courier new"/>
+          <w:b w:val="false"/>
+          <w:sz w:val="20"/>
+          <w:shd w:fill="FFFFFF" w:val="clear"/>
+        </w:rPr>
+        <w:t>files.append({</w:t>
+      </w:r>
+    </w:p>
+    <w:p>
+      <w:pPr>
+        <w:pStyle w:val="Normal"/>
+        <w:spacing w:lineRule="atLeast" w:line="285"/>
+        <w:ind w:hanging="0" w:left="0" w:right="0"/>
+        <w:rPr>
+          <w:rFonts w:ascii="Courier new" w:hAnsi="Courier new"/>
+          <w:b w:val="false"/>
+          <w:sz w:val="20"/>
+          <w:highlight w:val="none"/>
+          <w:shd w:fill="FFFFFF" w:val="clear"/>
+        </w:rPr>
+      </w:pPr>
+      <w:r>
+        <w:rPr>
+          <w:rFonts w:ascii="Courier new" w:hAnsi="Courier new"/>
+          <w:b w:val="false"/>
+          <w:sz w:val="20"/>
+          <w:shd w:fill="FFFFFF" w:val="clear"/>
+        </w:rPr>
+        <w:t>"name": filename,</w:t>
+      </w:r>
+    </w:p>
+    <w:p>
+      <w:pPr>
+        <w:pStyle w:val="Normal"/>
+        <w:spacing w:lineRule="atLeast" w:line="285"/>
+        <w:ind w:hanging="0" w:left="0" w:right="0"/>
+        <w:rPr>
+          <w:rFonts w:ascii="Courier new" w:hAnsi="Courier new"/>
+          <w:b w:val="false"/>
+          <w:sz w:val="20"/>
+          <w:highlight w:val="none"/>
+          <w:shd w:fill="FFFFFF" w:val="clear"/>
+        </w:rPr>
+      </w:pPr>
+      <w:r>
+        <w:rPr>
+          <w:rFonts w:ascii="Courier new" w:hAnsi="Courier new"/>
+          <w:b w:val="false"/>
+          <w:sz w:val="20"/>
+          <w:shd w:fill="FFFFFF" w:val="clear"/>
+        </w:rPr>
+        <w:t>"path": filepath,</w:t>
+      </w:r>
+    </w:p>
+    <w:p>
+      <w:pPr>
+        <w:pStyle w:val="Normal"/>
+        <w:spacing w:lineRule="atLeast" w:line="285"/>
+        <w:ind w:hanging="0" w:left="0" w:right="0"/>
+        <w:rPr>
+          <w:rFonts w:ascii="Courier new" w:hAnsi="Courier new"/>
+          <w:b w:val="false"/>
+          <w:sz w:val="20"/>
+          <w:highlight w:val="none"/>
+          <w:shd w:fill="FFFFFF" w:val="clear"/>
+        </w:rPr>
+      </w:pPr>
+      <w:r>
+        <w:rPr>
+          <w:rFonts w:ascii="Courier new" w:hAnsi="Courier new"/>
+          <w:b w:val="false"/>
+          <w:sz w:val="20"/>
+          <w:shd w:fill="FFFFFF" w:val="clear"/>
+        </w:rPr>
+        <w:t>"server": server_count</w:t>
+      </w:r>
+    </w:p>
+    <w:p>
+      <w:pPr>
+        <w:pStyle w:val="Normal"/>
+        <w:spacing w:lineRule="atLeast" w:line="285"/>
+        <w:ind w:hanging="0" w:left="0" w:right="0"/>
+        <w:rPr>
+          <w:rFonts w:ascii="Courier new" w:hAnsi="Courier new"/>
+          <w:b w:val="false"/>
+          <w:sz w:val="20"/>
+          <w:highlight w:val="none"/>
+          <w:shd w:fill="FFFFFF" w:val="clear"/>
+        </w:rPr>
+      </w:pPr>
+      <w:r>
+        <w:rPr>
+          <w:rFonts w:ascii="Courier new" w:hAnsi="Courier new"/>
+          <w:b w:val="false"/>
+          <w:sz w:val="20"/>
+          <w:shd w:fill="FFFFFF" w:val="clear"/>
+        </w:rPr>
+        <w:t>})</w:t>
+      </w:r>
+    </w:p>
+    <w:p>
+      <w:pPr>
+        <w:pStyle w:val="Normal"/>
+        <w:spacing w:lineRule="atLeast" w:line="285"/>
+        <w:ind w:hanging="0" w:left="0" w:right="0"/>
+        <w:rPr>
+          <w:rFonts w:ascii="Courier new" w:hAnsi="Courier new"/>
+          <w:b w:val="false"/>
+          <w:sz w:val="20"/>
+          <w:highlight w:val="none"/>
+          <w:shd w:fill="FFFFFF" w:val="clear"/>
+        </w:rPr>
+      </w:pPr>
+      <w:r>
+        <w:rPr>
+          <w:rFonts w:ascii="Courier new" w:hAnsi="Courier new"/>
+          <w:b w:val="false"/>
+          <w:sz w:val="20"/>
+          <w:shd w:fill="FFFFFF" w:val="clear"/>
+        </w:rPr>
+      </w:r>
+    </w:p>
+    <w:p>
+      <w:pPr>
+        <w:pStyle w:val="Normal"/>
+        <w:spacing w:lineRule="atLeast" w:line="285"/>
+        <w:ind w:hanging="0" w:left="0" w:right="0"/>
+        <w:rPr>
+          <w:rFonts w:ascii="Courier new" w:hAnsi="Courier new"/>
+          <w:b w:val="false"/>
+          <w:sz w:val="20"/>
+          <w:highlight w:val="none"/>
+          <w:shd w:fill="FFFFFF" w:val="clear"/>
+        </w:rPr>
+      </w:pPr>
+      <w:r>
+        <w:rPr>
+          <w:rFonts w:ascii="Courier new" w:hAnsi="Courier new"/>
+          <w:b w:val="false"/>
+          <w:sz w:val="20"/>
+          <w:shd w:fill="FFFFFF" w:val="clear"/>
+        </w:rPr>
+        <w:t>return {"files": files}</w:t>
+      </w:r>
+    </w:p>
+    <w:p>
+      <w:pPr>
+        <w:pStyle w:val="Normal"/>
+        <w:spacing w:lineRule="atLeast" w:line="285"/>
+        <w:ind w:hanging="0" w:left="0" w:right="0"/>
+        <w:rPr>
+          <w:rFonts w:ascii="Courier new" w:hAnsi="Courier new"/>
+          <w:b w:val="false"/>
+          <w:sz w:val="20"/>
+          <w:highlight w:val="none"/>
+          <w:shd w:fill="FFFFFF" w:val="clear"/>
+        </w:rPr>
+      </w:pPr>
+      <w:r>
+        <w:rPr>
+          <w:rFonts w:ascii="Courier new" w:hAnsi="Courier new"/>
+          <w:b w:val="false"/>
+          <w:sz w:val="20"/>
+          <w:shd w:fill="FFFFFF" w:val="clear"/>
+        </w:rPr>
+      </w:r>
+    </w:p>
+    <w:p>
+      <w:pPr>
+        <w:pStyle w:val="Normal"/>
+        <w:spacing w:lineRule="atLeast" w:line="285"/>
+        <w:ind w:hanging="0" w:left="0" w:right="0"/>
+        <w:rPr>
+          <w:rFonts w:ascii="Courier new" w:hAnsi="Courier new"/>
+          <w:b w:val="false"/>
+          <w:sz w:val="20"/>
+          <w:highlight w:val="none"/>
+          <w:shd w:fill="FFFFFF" w:val="clear"/>
+        </w:rPr>
+      </w:pPr>
+      <w:r>
+        <w:rPr>
+          <w:rFonts w:ascii="Courier new" w:hAnsi="Courier new"/>
+          <w:b w:val="false"/>
+          <w:sz w:val="20"/>
+          <w:shd w:fill="FFFFFF" w:val="clear"/>
+        </w:rPr>
+        <w:t>@application.get("/api/files/{item_name}")</w:t>
+      </w:r>
+    </w:p>
+    <w:p>
+      <w:pPr>
+        <w:pStyle w:val="Normal"/>
+        <w:spacing w:lineRule="atLeast" w:line="285"/>
+        <w:ind w:hanging="0" w:left="0" w:right="0"/>
+        <w:rPr>
+          <w:rFonts w:ascii="Courier new" w:hAnsi="Courier new"/>
+          <w:b w:val="false"/>
+          <w:sz w:val="20"/>
+          <w:highlight w:val="none"/>
+          <w:shd w:fill="FFFFFF" w:val="clear"/>
+        </w:rPr>
+      </w:pPr>
+      <w:r>
+        <w:rPr>
+          <w:rFonts w:ascii="Courier new" w:hAnsi="Courier new"/>
+          <w:b w:val="false"/>
+          <w:sz w:val="20"/>
+          <w:shd w:fill="FFFFFF" w:val="clear"/>
+        </w:rPr>
+        <w:t>def getFileByName(item_name: str):</w:t>
+      </w:r>
+    </w:p>
+    <w:p>
+      <w:pPr>
+        <w:pStyle w:val="Normal"/>
+        <w:spacing w:lineRule="atLeast" w:line="285"/>
+        <w:ind w:hanging="0" w:left="0" w:right="0"/>
+        <w:rPr>
+          <w:rFonts w:ascii="Courier new" w:hAnsi="Courier new"/>
+          <w:b w:val="false"/>
+          <w:sz w:val="20"/>
+          <w:highlight w:val="none"/>
+          <w:shd w:fill="FFFFFF" w:val="clear"/>
+        </w:rPr>
+      </w:pPr>
+      <w:r>
+        <w:rPr>
+          <w:rFonts w:ascii="Courier new" w:hAnsi="Courier new"/>
+          <w:b w:val="false"/>
+          <w:sz w:val="20"/>
+          <w:shd w:fill="FFFFFF" w:val="clear"/>
+        </w:rPr>
+        <w:t>file_path = os.path.join(files_dir, item_name)</w:t>
+      </w:r>
+    </w:p>
+    <w:p>
+      <w:pPr>
+        <w:pStyle w:val="Normal"/>
+        <w:spacing w:lineRule="atLeast" w:line="285"/>
+        <w:ind w:hanging="0" w:left="0" w:right="0"/>
+        <w:rPr>
+          <w:rFonts w:ascii="Courier new" w:hAnsi="Courier new"/>
+          <w:b w:val="false"/>
+          <w:sz w:val="20"/>
+          <w:highlight w:val="none"/>
+          <w:shd w:fill="FFFFFF" w:val="clear"/>
+        </w:rPr>
+      </w:pPr>
+      <w:r>
+        <w:rPr>
+          <w:rFonts w:ascii="Courier new" w:hAnsi="Courier new"/>
+          <w:b w:val="false"/>
+          <w:sz w:val="20"/>
+          <w:shd w:fill="FFFFFF" w:val="clear"/>
+        </w:rPr>
+      </w:r>
+    </w:p>
+    <w:p>
+      <w:pPr>
+        <w:pStyle w:val="Normal"/>
+        <w:spacing w:lineRule="atLeast" w:line="285"/>
+        <w:ind w:hanging="0" w:left="0" w:right="0"/>
+        <w:rPr>
+          <w:rFonts w:ascii="Courier new" w:hAnsi="Courier new"/>
+          <w:b w:val="false"/>
+          <w:sz w:val="20"/>
+          <w:highlight w:val="none"/>
+          <w:shd w:fill="FFFFFF" w:val="clear"/>
+        </w:rPr>
+      </w:pPr>
+      <w:r>
+        <w:rPr>
+          <w:rFonts w:ascii="Courier new" w:hAnsi="Courier new"/>
+          <w:b w:val="false"/>
+          <w:sz w:val="20"/>
+          <w:shd w:fill="FFFFFF" w:val="clear"/>
+        </w:rPr>
+        <w:t>if os.path.isfile(file_path):</w:t>
+      </w:r>
+    </w:p>
+    <w:p>
+      <w:pPr>
+        <w:pStyle w:val="Normal"/>
+        <w:spacing w:lineRule="atLeast" w:line="285"/>
+        <w:ind w:hanging="0" w:left="0" w:right="0"/>
+        <w:rPr>
+          <w:rFonts w:ascii="Courier new" w:hAnsi="Courier new"/>
+          <w:b w:val="false"/>
+          <w:sz w:val="20"/>
+          <w:highlight w:val="none"/>
+          <w:shd w:fill="FFFFFF" w:val="clear"/>
+        </w:rPr>
+      </w:pPr>
+      <w:r>
+        <w:rPr>
+          <w:rFonts w:ascii="Courier new" w:hAnsi="Courier new"/>
+          <w:b w:val="false"/>
+          <w:sz w:val="20"/>
+          <w:shd w:fill="FFFFFF" w:val="clear"/>
+        </w:rPr>
+        <w:t>return FileResponse(</w:t>
+      </w:r>
+    </w:p>
+    <w:p>
+      <w:pPr>
+        <w:pStyle w:val="Normal"/>
+        <w:spacing w:lineRule="atLeast" w:line="285"/>
+        <w:ind w:hanging="0" w:left="0" w:right="0"/>
+        <w:rPr>
+          <w:rFonts w:ascii="Courier new" w:hAnsi="Courier new"/>
+          <w:b w:val="false"/>
+          <w:sz w:val="20"/>
+          <w:highlight w:val="none"/>
+          <w:shd w:fill="FFFFFF" w:val="clear"/>
+        </w:rPr>
+      </w:pPr>
+      <w:r>
+        <w:rPr>
+          <w:rFonts w:ascii="Courier new" w:hAnsi="Courier new"/>
+          <w:b w:val="false"/>
+          <w:sz w:val="20"/>
+          <w:shd w:fill="FFFFFF" w:val="clear"/>
+        </w:rPr>
+        <w:t>path = file_path,</w:t>
+      </w:r>
+    </w:p>
+    <w:p>
+      <w:pPr>
+        <w:pStyle w:val="Normal"/>
+        <w:spacing w:lineRule="atLeast" w:line="285"/>
+        <w:ind w:hanging="0" w:left="0" w:right="0"/>
+        <w:rPr>
+          <w:rFonts w:ascii="Courier new" w:hAnsi="Courier new"/>
+          <w:b w:val="false"/>
+          <w:sz w:val="20"/>
+          <w:highlight w:val="none"/>
+          <w:shd w:fill="FFFFFF" w:val="clear"/>
+        </w:rPr>
+      </w:pPr>
+      <w:r>
+        <w:rPr>
+          <w:rFonts w:ascii="Courier new" w:hAnsi="Courier new"/>
+          <w:b w:val="false"/>
+          <w:sz w:val="20"/>
+          <w:shd w:fill="FFFFFF" w:val="clear"/>
+        </w:rPr>
+        <w:t>filename = item_name,</w:t>
+      </w:r>
+    </w:p>
+    <w:p>
+      <w:pPr>
+        <w:pStyle w:val="Normal"/>
+        <w:spacing w:lineRule="atLeast" w:line="285"/>
+        <w:ind w:hanging="0" w:left="0" w:right="0"/>
+        <w:rPr>
+          <w:rFonts w:ascii="Courier new" w:hAnsi="Courier new"/>
+          <w:b w:val="false"/>
+          <w:sz w:val="20"/>
+          <w:highlight w:val="none"/>
+          <w:shd w:fill="FFFFFF" w:val="clear"/>
+        </w:rPr>
+      </w:pPr>
+      <w:r>
+        <w:rPr>
+          <w:rFonts w:ascii="Courier new" w:hAnsi="Courier new"/>
+          <w:b w:val="false"/>
+          <w:sz w:val="20"/>
+          <w:shd w:fill="FFFFFF" w:val="clear"/>
+        </w:rPr>
+        <w:t>media_type="application/octet-stream"</w:t>
+      </w:r>
+    </w:p>
+    <w:p>
+      <w:pPr>
+        <w:pStyle w:val="Normal"/>
+        <w:spacing w:lineRule="atLeast" w:line="285"/>
+        <w:ind w:hanging="0" w:left="0" w:right="0"/>
+        <w:rPr>
+          <w:rFonts w:ascii="Courier new" w:hAnsi="Courier new"/>
+          <w:b w:val="false"/>
+          <w:sz w:val="20"/>
+          <w:highlight w:val="none"/>
+          <w:shd w:fill="FFFFFF" w:val="clear"/>
+        </w:rPr>
+      </w:pPr>
+      <w:r>
+        <w:rPr>
+          <w:rFonts w:ascii="Courier new" w:hAnsi="Courier new"/>
+          <w:b w:val="false"/>
+          <w:sz w:val="20"/>
+          <w:shd w:fill="FFFFFF" w:val="clear"/>
+        </w:rPr>
+        <w:t>)</w:t>
+      </w:r>
+    </w:p>
+    <w:p>
+      <w:pPr>
+        <w:pStyle w:val="Normal"/>
+        <w:spacing w:lineRule="atLeast" w:line="285"/>
+        <w:ind w:hanging="0" w:left="0" w:right="0"/>
+        <w:rPr>
+          <w:rFonts w:ascii="Courier new" w:hAnsi="Courier new"/>
+          <w:b w:val="false"/>
+          <w:sz w:val="20"/>
+          <w:highlight w:val="none"/>
+          <w:shd w:fill="FFFFFF" w:val="clear"/>
+        </w:rPr>
+      </w:pPr>
+      <w:r>
+        <w:rPr>
+          <w:rFonts w:ascii="Courier new" w:hAnsi="Courier new"/>
+          <w:b w:val="false"/>
+          <w:sz w:val="20"/>
+          <w:shd w:fill="FFFFFF" w:val="clear"/>
+        </w:rPr>
+        <w:t>raise HTTPException(status_code=404, detail="File not found")</w:t>
+      </w:r>
+    </w:p>
+    <w:p>
+      <w:pPr>
+        <w:pStyle w:val="Normal"/>
+        <w:spacing w:lineRule="auto" w:line="360"/>
+        <w:ind w:firstLine="709"/>
+        <w:jc w:val="both"/>
+        <w:rPr>
+          <w:sz w:val="28"/>
+        </w:rPr>
+      </w:pPr>
+      <w:r>
+        <w:rPr/>
+      </w:r>
+    </w:p>
+    <w:p>
+      <w:pPr>
+        <w:pStyle w:val="Normal"/>
+        <w:spacing w:lineRule="auto" w:line="360"/>
+        <w:ind w:firstLine="709"/>
+        <w:jc w:val="both"/>
+        <w:rPr>
+          <w:sz w:val="28"/>
+        </w:rPr>
+      </w:pPr>
+      <w:r>
+        <w:rPr>
+          <w:sz w:val="28"/>
+        </w:rPr>
+        <w:t xml:space="preserve">Для запуска серверов необходимо запустить каждый из них командой fastapi run &lt;path_to_python_file&gt;. Для проверки работоспособности сервером можно перейти в браузер по URL </w:t>
+      </w:r>
+      <w:hyperlink r:id="rId2">
+        <w:r>
+          <w:rPr>
+            <w:rStyle w:val="Hyperlink"/>
+            <w:sz w:val="28"/>
+          </w:rPr>
+          <w:t>http://localhost:8000</w:t>
+        </w:r>
+      </w:hyperlink>
+      <w:r>
+        <w:rPr>
+          <w:sz w:val="28"/>
+        </w:rPr>
+        <w:t xml:space="preserve"> и необходимому endpoint или при помощи </w:t>
+      </w:r>
+      <w:r>
+        <w:rPr>
+          <w:sz w:val="28"/>
+        </w:rPr>
+        <w:t>команды curl.</w:t>
+      </w:r>
+    </w:p>
+    <w:p>
+      <w:pPr>
+        <w:pStyle w:val="Normal"/>
+        <w:spacing w:lineRule="auto" w:line="360"/>
+        <w:ind w:hanging="0"/>
+        <w:jc w:val="center"/>
+        <w:rPr/>
+      </w:pPr>
+      <w:r>
+        <w:rPr/>
+        <w:drawing>
+          <wp:inline distT="0" distB="0" distL="0" distR="0">
+            <wp:extent cx="5940425" cy="2319655"/>
+            <wp:effectExtent l="0" t="0" r="0" b="0"/>
+            <wp:docPr id="1" name="Image1" descr=""/>
+            <wp:cNvGraphicFramePr>
+              <a:graphicFrameLocks xmlns:a="http://schemas.openxmlformats.org/drawingml/2006/main" noChangeAspect="1"/>
+            </wp:cNvGraphicFramePr>
+            <a:graphic xmlns:a="http://schemas.openxmlformats.org/drawingml/2006/main">
+              <a:graphicData uri="http://schemas.openxmlformats.org/drawingml/2006/picture">
+                <pic:pic xmlns:pic="http://schemas.openxmlformats.org/drawingml/2006/picture">
+                  <pic:nvPicPr>
+                    <pic:cNvPr id="1" name="Image1" descr=""/>
+                    <pic:cNvPicPr>
+                      <a:picLocks noChangeAspect="1" noChangeArrowheads="1"/>
+                    </pic:cNvPicPr>
+                  </pic:nvPicPr>
+                  <pic:blipFill>
+                    <a:blip r:embed="rId3"/>
+                    <a:stretch>
+                      <a:fillRect/>
+                    </a:stretch>
+                  </pic:blipFill>
+                  <pic:spPr bwMode="auto">
+                    <a:xfrm>
+                      <a:off x="0" y="0"/>
+                      <a:ext cx="5940425" cy="2319655"/>
+                    </a:xfrm>
+                    <a:prstGeom prst="rect">
+                      <a:avLst/>
+                    </a:prstGeom>
+                  </pic:spPr>
+                </pic:pic>
+              </a:graphicData>
+            </a:graphic>
+          </wp:inline>
+        </w:drawing>
       </w:r>
     </w:p>
     <w:p>
@@ -1179,24 +3594,21 @@
         <w:pStyle w:val="Normal"/>
         <w:spacing w:lineRule="auto" w:line="360"/>
         <w:jc w:val="center"/>
-        <w:rPr>
-          <w:sz w:val="28"/>
-          <w:szCs w:val="28"/>
-        </w:rPr>
-      </w:pPr>
-      <w:r>
-        <w:rPr>
-          <w:sz w:val="28"/>
-          <w:szCs w:val="28"/>
-        </w:rPr>
-        <w:t xml:space="preserve">Рисунок 1. Картинка </w:t>
-      </w:r>
-      <w:r>
-        <w:rPr>
-          <w:sz w:val="28"/>
-          <w:szCs w:val="28"/>
-        </w:rPr>
-        <w:t>=)</w:t>
+        <w:rPr/>
+      </w:pPr>
+      <w:r>
+        <w:rPr>
+          <w:sz w:val="28"/>
+          <w:szCs w:val="28"/>
+        </w:rPr>
+        <w:t xml:space="preserve">Рисунок 1. </w:t>
+      </w:r>
+      <w:r>
+        <w:rPr>
+          <w:sz w:val="28"/>
+          <w:szCs w:val="28"/>
+        </w:rPr>
+        <w:t>Вывод всех файлов на серверах</w:t>
       </w:r>
       <w:r>
         <w:rPr>
@@ -1217,7 +3629,171 @@
         </w:rPr>
       </w:pPr>
       <w:r>
-        <w:rPr/>
+        <w:rPr>
+          <w:sz w:val="28"/>
+          <w:szCs w:val="28"/>
+        </w:rPr>
+      </w:r>
+    </w:p>
+    <w:p>
+      <w:pPr>
+        <w:pStyle w:val="Normal"/>
+        <w:spacing w:lineRule="auto" w:line="360"/>
+        <w:jc w:val="center"/>
+        <w:rPr>
+          <w:sz w:val="28"/>
+          <w:szCs w:val="28"/>
+        </w:rPr>
+      </w:pPr>
+      <w:r>
+        <w:rPr>
+          <w:sz w:val="28"/>
+          <w:szCs w:val="28"/>
+        </w:rPr>
+        <w:drawing>
+          <wp:inline distT="0" distB="0" distL="0" distR="0">
+            <wp:extent cx="5940425" cy="394335"/>
+            <wp:effectExtent l="0" t="0" r="0" b="0"/>
+            <wp:docPr id="2" name="Image2" descr=""/>
+            <wp:cNvGraphicFramePr>
+              <a:graphicFrameLocks xmlns:a="http://schemas.openxmlformats.org/drawingml/2006/main" noChangeAspect="1"/>
+            </wp:cNvGraphicFramePr>
+            <a:graphic xmlns:a="http://schemas.openxmlformats.org/drawingml/2006/main">
+              <a:graphicData uri="http://schemas.openxmlformats.org/drawingml/2006/picture">
+                <pic:pic xmlns:pic="http://schemas.openxmlformats.org/drawingml/2006/picture">
+                  <pic:nvPicPr>
+                    <pic:cNvPr id="2" name="Image2" descr=""/>
+                    <pic:cNvPicPr>
+                      <a:picLocks noChangeAspect="1" noChangeArrowheads="1"/>
+                    </pic:cNvPicPr>
+                  </pic:nvPicPr>
+                  <pic:blipFill>
+                    <a:blip r:embed="rId4"/>
+                    <a:stretch>
+                      <a:fillRect/>
+                    </a:stretch>
+                  </pic:blipFill>
+                  <pic:spPr bwMode="auto">
+                    <a:xfrm>
+                      <a:off x="0" y="0"/>
+                      <a:ext cx="5940425" cy="394335"/>
+                    </a:xfrm>
+                    <a:prstGeom prst="rect">
+                      <a:avLst/>
+                    </a:prstGeom>
+                  </pic:spPr>
+                </pic:pic>
+              </a:graphicData>
+            </a:graphic>
+          </wp:inline>
+        </w:drawing>
+      </w:r>
+    </w:p>
+    <w:p>
+      <w:pPr>
+        <w:pStyle w:val="Normal"/>
+        <w:spacing w:lineRule="auto" w:line="360"/>
+        <w:jc w:val="center"/>
+        <w:rPr>
+          <w:sz w:val="28"/>
+          <w:szCs w:val="28"/>
+        </w:rPr>
+      </w:pPr>
+      <w:r>
+        <w:rPr>
+          <w:sz w:val="28"/>
+          <w:szCs w:val="28"/>
+        </w:rPr>
+        <w:t>Рисунок 2. Скачивание запрошенного файла с первого сервера.</w:t>
+      </w:r>
+    </w:p>
+    <w:p>
+      <w:pPr>
+        <w:pStyle w:val="Normal"/>
+        <w:spacing w:lineRule="auto" w:line="360"/>
+        <w:jc w:val="center"/>
+        <w:rPr>
+          <w:sz w:val="28"/>
+          <w:szCs w:val="28"/>
+        </w:rPr>
+      </w:pPr>
+      <w:r>
+        <w:rPr>
+          <w:sz w:val="28"/>
+          <w:szCs w:val="28"/>
+        </w:rPr>
+        <w:drawing>
+          <wp:inline distT="0" distB="0" distL="0" distR="0">
+            <wp:extent cx="5940425" cy="322580"/>
+            <wp:effectExtent l="0" t="0" r="0" b="0"/>
+            <wp:docPr id="3" name="Image3" descr=""/>
+            <wp:cNvGraphicFramePr>
+              <a:graphicFrameLocks xmlns:a="http://schemas.openxmlformats.org/drawingml/2006/main" noChangeAspect="1"/>
+            </wp:cNvGraphicFramePr>
+            <a:graphic xmlns:a="http://schemas.openxmlformats.org/drawingml/2006/main">
+              <a:graphicData uri="http://schemas.openxmlformats.org/drawingml/2006/picture">
+                <pic:pic xmlns:pic="http://schemas.openxmlformats.org/drawingml/2006/picture">
+                  <pic:nvPicPr>
+                    <pic:cNvPr id="3" name="Image3" descr=""/>
+                    <pic:cNvPicPr>
+                      <a:picLocks noChangeAspect="1" noChangeArrowheads="1"/>
+                    </pic:cNvPicPr>
+                  </pic:nvPicPr>
+                  <pic:blipFill>
+                    <a:blip r:embed="rId5"/>
+                    <a:stretch>
+                      <a:fillRect/>
+                    </a:stretch>
+                  </pic:blipFill>
+                  <pic:spPr bwMode="auto">
+                    <a:xfrm>
+                      <a:off x="0" y="0"/>
+                      <a:ext cx="5940425" cy="322580"/>
+                    </a:xfrm>
+                    <a:prstGeom prst="rect">
+                      <a:avLst/>
+                    </a:prstGeom>
+                  </pic:spPr>
+                </pic:pic>
+              </a:graphicData>
+            </a:graphic>
+          </wp:inline>
+        </w:drawing>
+      </w:r>
+    </w:p>
+    <w:p>
+      <w:pPr>
+        <w:pStyle w:val="Normal"/>
+        <w:spacing w:lineRule="auto" w:line="360"/>
+        <w:jc w:val="center"/>
+        <w:rPr>
+          <w:sz w:val="28"/>
+          <w:szCs w:val="28"/>
+        </w:rPr>
+      </w:pPr>
+      <w:r>
+        <w:rPr>
+          <w:sz w:val="28"/>
+          <w:szCs w:val="28"/>
+        </w:rPr>
+        <w:t>Рисунок 3. Скачивание запрошенного файла со второго сервера.</w:t>
+      </w:r>
+    </w:p>
+    <w:p>
+      <w:pPr>
+        <w:pStyle w:val="Normal"/>
+        <w:spacing w:lineRule="auto" w:line="360"/>
+        <w:jc w:val="center"/>
+        <w:rPr>
+          <w:sz w:val="28"/>
+          <w:szCs w:val="28"/>
+        </w:rPr>
+      </w:pPr>
+      <w:r>
+        <w:rPr>
+          <w:sz w:val="28"/>
+          <w:szCs w:val="28"/>
+        </w:rPr>
       </w:r>
     </w:p>
     <w:p>
@@ -1263,9 +3839,9 @@
       </w:r>
     </w:p>
     <w:sectPr>
-      <w:footerReference w:type="even" r:id="rId2"/>
-      <w:footerReference w:type="default" r:id="rId3"/>
-      <w:footerReference w:type="first" r:id="rId4"/>
+      <w:footerReference w:type="even" r:id="rId6"/>
+      <w:footerReference w:type="default" r:id="rId7"/>
+      <w:footerReference w:type="first" r:id="rId8"/>
       <w:type w:val="nextPage"/>
       <w:pgSz w:w="11906" w:h="16838"/>
       <w:pgMar w:left="1701" w:right="850" w:gutter="0" w:header="0" w:top="1134" w:footer="708" w:bottom="1134"/>
@@ -1324,7 +3900,7 @@
         </w:r>
         <w:r>
           <w:rPr/>
-          <w:t>2</w:t>
+          <w:t>3</w:t>
         </w:r>
         <w:r>
           <w:rPr/>
@@ -1771,7 +4347,7 @@
       <w:kern w:val="0"/>
       <w:sz w:val="22"/>
       <w:szCs w:val="20"/>
-      <w:lang w:eastAsia="ru-RU" w:val="ru-RU" w:bidi="ar-SA"/>
+      <w:lang w:val="ru-RU" w:eastAsia="ru-RU" w:bidi="ar-SA"/>
     </w:rPr>
   </w:style>
   <w:style w:type="character" w:styleId="DefaultParagraphFont" w:default="1">
@@ -1866,6 +4442,13 @@
       <w:color w:val="000000"/>
       <w:szCs w:val="20"/>
       <w:lang w:eastAsia="ru-RU"/>
+    </w:rPr>
+  </w:style>
+  <w:style w:type="character" w:styleId="Hyperlink">
+    <w:name w:val="Hyperlink"/>
+    <w:rPr>
+      <w:color w:val="000080"/>
+      <w:u w:val="single"/>
     </w:rPr>
   </w:style>
   <w:style w:type="paragraph" w:styleId="Heading" w:customStyle="1">

</xml_diff>